<commit_message>
Regenerate DOCX paper matching current LaTeX version
Complete rewrite of generate_paper_docx.py to match sjwp_paper.tex:
- All text content synchronized with LaTeX (expanded intro, methods,
  results, discussion, conclusions)
- New figures: fig_encoder_microbiomenet_v2.jpg, fig_encoder_toxigene_v2.jpg
- All 11 figures included with captions
- Both tables (SENTINEL-DB, per-encoder performance)
- All 30 references
- US Letter format, 12pt Times New Roman, 1.08 spacing
- Prelims in paragraph form (abbreviations, etc.)
- PDF version generated via docx2pdf

Co-Authored-By: Claude Opus 4.6 (1M context) <noreply@anthropic.com>
</commit_message>
<xml_diff>
--- a/paper/sjwp_paper.docx
+++ b/paper/sjwp_paper.docx
@@ -93,12 +93,7 @@
     </w:p>
     <w:p>
       <w:r>
-        <w:t>Water contamination events expose millions to toxic substances because current monitoring detects pollution too late. SENTINEL is the first artificial intelligence system to fuse five environmental sensing modalities—physicochemical sensors, satellite remote sensing, aquatic metagenomics, transcriptomic biomarkers, and organismal behavioral signals—for early water pollution detection. Trained on SENTINEL-DB (390 million records from 13 public sources across 105 countries), SENTINEL achieves AUROC = 0.973 [95% CI: 0.964–0.981] for multimodal anomaly detection, significantly outperforming the best single modality (p = 0.002) and four standard baselines (LSTM, Transformer, Isolation Forest, One-Class SVM). Validated against 10 contamination events—4 historical case studies and 6 real NEON sensor events—SENTINEL detected all 10 before official reports, with a mean lead time of 446.8 hours (18.6 days). The system detects harmful algal blooms 201.6 hours before official reports, Gulf of Mexico hypoxia 52 days early, and real NEON events including DO depletion, storm conductance spikes, and agricultural runoff 18 days before routine monitoring. Distribution-free conformal prediction provides coverage guarantees (≥0.95), causal discovery reveals 375 mechanistic pollution pathways from real data, and a composite risk index ranks 32 NEON sites by severity tier. Cost-effective deployment begins at $0.50 per site per year with satellite coverage alone.</w:t>
-      </w:r>
-    </w:p>
-    <w:p>
-      <w:r>
-        <w:br w:type="page"/>
+        <w:t>Water contamination events expose millions to toxic substances because current monitoring detects pollution too late. SENTINEL is the first artificial intelligence system to fuse five environmental sensing modalities—physicochemical sensors, satellite remote sensing, aquatic metagenomics, transcriptomic biomarkers, and organismal behavioral signals—for early water pollution detection. Trained on SENTINEL-DB (390 million records from 13 public sources across 105 countries), SENTINEL achieves AUROC = 0.939 [95% CI: 0.922–0.956] for multimodal anomaly detection, significantly outperforming the best single modality (p = 0.002) and published state-of-the-art models including MCN-LSTM (Sensors 2023, +0.052 AUROC) and Deep Autoencoder (PLOS CompBio 2024, +0.042 AUROC). Validated on real downloaded USGS sensor data, SENTINEL detected 6 of 6 major contamination events with available monitoring data—including Chesapeake Bay hypoxia 90 days early, Gulf of Mexico Dead Zone 87 days early, and Lake Erie HAB 59 days early—with a mean lead time of 66 days. An additional 6 real NEON sensor events were detected 18 days before routine monitoring, and 21 research-validated events confirm generalization across 9 contamination types. Distribution-free conformal prediction provides coverage guarantees (≥0.95), causal discovery reveals 375 mechanistic pollution pathways from real data, and a composite risk index ranks 32 NEON sites by severity tier. Cost-effective deployment begins at $0.50 per site per year with satellite coverage alone.</w:t>
       </w:r>
     </w:p>
     <w:p>
@@ -119,16 +114,12 @@
         </w:rPr>
         <w:t>I. Abstract</w:t>
       </w:r>
-    </w:p>
-    <w:p>
-      <w:pPr>
-        <w:spacing w:after="0" w:line="288" w:lineRule="auto"/>
-      </w:pPr>
       <w:r>
         <w:rPr>
           <w:sz w:val="22"/>
         </w:rPr>
-        <w:t>II. Table of Contents</w:t>
+        <w:tab/>
+        <w:t>1</w:t>
       </w:r>
     </w:p>
     <w:p>
@@ -139,40 +130,14 @@
         <w:rPr>
           <w:sz w:val="22"/>
         </w:rPr>
-        <w:t>III. Key Words</w:t>
+        <w:t>II–VI. Preliminary Matters</w:t>
       </w:r>
-    </w:p>
-    <w:p>
-      <w:pPr>
-        <w:spacing w:after="0" w:line="288" w:lineRule="auto"/>
-      </w:pPr>
       <w:r>
         <w:rPr>
           <w:sz w:val="22"/>
         </w:rPr>
-        <w:t>IV. Abbreviations</w:t>
-      </w:r>
-    </w:p>
-    <w:p>
-      <w:pPr>
-        <w:spacing w:after="0" w:line="288" w:lineRule="auto"/>
-      </w:pPr>
-      <w:r>
-        <w:rPr>
-          <w:sz w:val="22"/>
-        </w:rPr>
-        <w:t>V. Acknowledgements</w:t>
-      </w:r>
-    </w:p>
-    <w:p>
-      <w:pPr>
-        <w:spacing w:after="0" w:line="288" w:lineRule="auto"/>
-      </w:pPr>
-      <w:r>
-        <w:rPr>
-          <w:sz w:val="22"/>
-        </w:rPr>
-        <w:t>VI. Biography</w:t>
+        <w:tab/>
+        <w:t>1</w:t>
       </w:r>
     </w:p>
     <w:p>
@@ -185,6 +150,13 @@
         </w:rPr>
         <w:t>1. Introduction</w:t>
       </w:r>
+      <w:r>
+        <w:rPr>
+          <w:sz w:val="22"/>
+        </w:rPr>
+        <w:tab/>
+        <w:t>2</w:t>
+      </w:r>
     </w:p>
     <w:p>
       <w:pPr>
@@ -195,6 +167,13 @@
           <w:sz w:val="22"/>
         </w:rPr>
         <w:t>2. Materials and Methods</w:t>
+      </w:r>
+      <w:r>
+        <w:rPr>
+          <w:sz w:val="22"/>
+        </w:rPr>
+        <w:tab/>
+        <w:t>4</w:t>
       </w:r>
     </w:p>
     <w:p>
@@ -207,6 +186,13 @@
         </w:rPr>
         <w:t>3. Results</w:t>
       </w:r>
+      <w:r>
+        <w:rPr>
+          <w:sz w:val="22"/>
+        </w:rPr>
+        <w:tab/>
+        <w:t>9</w:t>
+      </w:r>
     </w:p>
     <w:p>
       <w:pPr>
@@ -217,6 +203,13 @@
           <w:sz w:val="22"/>
         </w:rPr>
         <w:t>4. Discussion</w:t>
+      </w:r>
+      <w:r>
+        <w:rPr>
+          <w:sz w:val="22"/>
+        </w:rPr>
+        <w:tab/>
+        <w:t>15</w:t>
       </w:r>
     </w:p>
     <w:p>
@@ -229,6 +222,13 @@
         </w:rPr>
         <w:t>5. Conclusions</w:t>
       </w:r>
+      <w:r>
+        <w:rPr>
+          <w:sz w:val="22"/>
+        </w:rPr>
+        <w:tab/>
+        <w:t>17</w:t>
+      </w:r>
     </w:p>
     <w:p>
       <w:pPr>
@@ -239,6 +239,13 @@
           <w:sz w:val="22"/>
         </w:rPr>
         <w:t>6. References</w:t>
+      </w:r>
+      <w:r>
+        <w:rPr>
+          <w:sz w:val="22"/>
+        </w:rPr>
+        <w:tab/>
+        <w:t>18</w:t>
       </w:r>
     </w:p>
     <w:p>
@@ -262,593 +269,11 @@
         <w:t>IV. Abbreviations and Acronyms</w:t>
       </w:r>
     </w:p>
-    <w:tbl>
-      <w:tblPr>
-        <w:tblStyle w:val="TableGrid"/>
-        <w:tblW w:type="auto" w:w="0"/>
-        <w:tblLook w:firstColumn="1" w:firstRow="1" w:lastColumn="0" w:lastRow="0" w:noHBand="0" w:noVBand="1" w:val="04A0"/>
-      </w:tblPr>
-      <w:tblGrid>
-        <w:gridCol w:w="4873"/>
-        <w:gridCol w:w="4873"/>
-      </w:tblGrid>
-      <w:tr>
-        <w:tc>
-          <w:tcPr>
-            <w:tcW w:type="dxa" w:w="4873"/>
-          </w:tcPr>
-          <w:p>
-            <w:pPr>
-              <w:spacing w:after="0"/>
-            </w:pPr>
-            <w:r>
-              <w:rPr>
-                <w:rFonts w:ascii="Times New Roman" w:hAnsi="Times New Roman"/>
-                <w:sz w:val="20"/>
-              </w:rPr>
-              <w:t>AUROC</w:t>
-            </w:r>
-          </w:p>
-        </w:tc>
-        <w:tc>
-          <w:tcPr>
-            <w:tcW w:type="dxa" w:w="4873"/>
-          </w:tcPr>
-          <w:p>
-            <w:pPr>
-              <w:spacing w:after="0"/>
-            </w:pPr>
-            <w:r>
-              <w:rPr>
-                <w:rFonts w:ascii="Times New Roman" w:hAnsi="Times New Roman"/>
-                <w:sz w:val="20"/>
-              </w:rPr>
-              <w:t>Area Under the Receiver Operating Characteristic Curve</w:t>
-            </w:r>
-          </w:p>
-        </w:tc>
-      </w:tr>
-      <w:tr>
-        <w:tc>
-          <w:tcPr>
-            <w:tcW w:type="dxa" w:w="4873"/>
-          </w:tcPr>
-          <w:p>
-            <w:pPr>
-              <w:spacing w:after="0"/>
-            </w:pPr>
-            <w:r>
-              <w:rPr>
-                <w:rFonts w:ascii="Times New Roman" w:hAnsi="Times New Roman"/>
-                <w:sz w:val="20"/>
-              </w:rPr>
-              <w:t>CI</w:t>
-            </w:r>
-          </w:p>
-        </w:tc>
-        <w:tc>
-          <w:tcPr>
-            <w:tcW w:type="dxa" w:w="4873"/>
-          </w:tcPr>
-          <w:p>
-            <w:pPr>
-              <w:spacing w:after="0"/>
-            </w:pPr>
-            <w:r>
-              <w:rPr>
-                <w:rFonts w:ascii="Times New Roman" w:hAnsi="Times New Roman"/>
-                <w:sz w:val="20"/>
-              </w:rPr>
-              <w:t>Confidence Interval</w:t>
-            </w:r>
-          </w:p>
-        </w:tc>
-      </w:tr>
-      <w:tr>
-        <w:tc>
-          <w:tcPr>
-            <w:tcW w:type="dxa" w:w="4873"/>
-          </w:tcPr>
-          <w:p>
-            <w:pPr>
-              <w:spacing w:after="0"/>
-            </w:pPr>
-            <w:r>
-              <w:rPr>
-                <w:rFonts w:ascii="Times New Roman" w:hAnsi="Times New Roman"/>
-                <w:sz w:val="20"/>
-              </w:rPr>
-              <w:t>CLR</w:t>
-            </w:r>
-          </w:p>
-        </w:tc>
-        <w:tc>
-          <w:tcPr>
-            <w:tcW w:type="dxa" w:w="4873"/>
-          </w:tcPr>
-          <w:p>
-            <w:pPr>
-              <w:spacing w:after="0"/>
-            </w:pPr>
-            <w:r>
-              <w:rPr>
-                <w:rFonts w:ascii="Times New Roman" w:hAnsi="Times New Roman"/>
-                <w:sz w:val="20"/>
-              </w:rPr>
-              <w:t>Centered Log-Ratio transform</w:t>
-            </w:r>
-          </w:p>
-        </w:tc>
-      </w:tr>
-      <w:tr>
-        <w:tc>
-          <w:tcPr>
-            <w:tcW w:type="dxa" w:w="4873"/>
-          </w:tcPr>
-          <w:p>
-            <w:pPr>
-              <w:spacing w:after="0"/>
-            </w:pPr>
-            <w:r>
-              <w:rPr>
-                <w:rFonts w:ascii="Times New Roman" w:hAnsi="Times New Roman"/>
-                <w:sz w:val="20"/>
-              </w:rPr>
-              <w:t>DO</w:t>
-            </w:r>
-          </w:p>
-        </w:tc>
-        <w:tc>
-          <w:tcPr>
-            <w:tcW w:type="dxa" w:w="4873"/>
-          </w:tcPr>
-          <w:p>
-            <w:pPr>
-              <w:spacing w:after="0"/>
-            </w:pPr>
-            <w:r>
-              <w:rPr>
-                <w:rFonts w:ascii="Times New Roman" w:hAnsi="Times New Roman"/>
-                <w:sz w:val="20"/>
-              </w:rPr>
-              <w:t>Dissolved Oxygen</w:t>
-            </w:r>
-          </w:p>
-        </w:tc>
-      </w:tr>
-      <w:tr>
-        <w:tc>
-          <w:tcPr>
-            <w:tcW w:type="dxa" w:w="4873"/>
-          </w:tcPr>
-          <w:p>
-            <w:pPr>
-              <w:spacing w:after="0"/>
-            </w:pPr>
-            <w:r>
-              <w:rPr>
-                <w:rFonts w:ascii="Times New Roman" w:hAnsi="Times New Roman"/>
-                <w:sz w:val="20"/>
-              </w:rPr>
-              <w:t>ECE</w:t>
-            </w:r>
-          </w:p>
-        </w:tc>
-        <w:tc>
-          <w:tcPr>
-            <w:tcW w:type="dxa" w:w="4873"/>
-          </w:tcPr>
-          <w:p>
-            <w:pPr>
-              <w:spacing w:after="0"/>
-            </w:pPr>
-            <w:r>
-              <w:rPr>
-                <w:rFonts w:ascii="Times New Roman" w:hAnsi="Times New Roman"/>
-                <w:sz w:val="20"/>
-              </w:rPr>
-              <w:t>Expected Calibration Error</w:t>
-            </w:r>
-          </w:p>
-        </w:tc>
-      </w:tr>
-      <w:tr>
-        <w:tc>
-          <w:tcPr>
-            <w:tcW w:type="dxa" w:w="4873"/>
-          </w:tcPr>
-          <w:p>
-            <w:pPr>
-              <w:spacing w:after="0"/>
-            </w:pPr>
-            <w:r>
-              <w:rPr>
-                <w:rFonts w:ascii="Times New Roman" w:hAnsi="Times New Roman"/>
-                <w:sz w:val="20"/>
-              </w:rPr>
-              <w:t>EMP</w:t>
-            </w:r>
-          </w:p>
-        </w:tc>
-        <w:tc>
-          <w:tcPr>
-            <w:tcW w:type="dxa" w:w="4873"/>
-          </w:tcPr>
-          <w:p>
-            <w:pPr>
-              <w:spacing w:after="0"/>
-            </w:pPr>
-            <w:r>
-              <w:rPr>
-                <w:rFonts w:ascii="Times New Roman" w:hAnsi="Times New Roman"/>
-                <w:sz w:val="20"/>
-              </w:rPr>
-              <w:t>Earth Microbiome Project</w:t>
-            </w:r>
-          </w:p>
-        </w:tc>
-      </w:tr>
-      <w:tr>
-        <w:tc>
-          <w:tcPr>
-            <w:tcW w:type="dxa" w:w="4873"/>
-          </w:tcPr>
-          <w:p>
-            <w:pPr>
-              <w:spacing w:after="0"/>
-            </w:pPr>
-            <w:r>
-              <w:rPr>
-                <w:rFonts w:ascii="Times New Roman" w:hAnsi="Times New Roman"/>
-                <w:sz w:val="20"/>
-              </w:rPr>
-              <w:t>EPA</w:t>
-            </w:r>
-          </w:p>
-        </w:tc>
-        <w:tc>
-          <w:tcPr>
-            <w:tcW w:type="dxa" w:w="4873"/>
-          </w:tcPr>
-          <w:p>
-            <w:pPr>
-              <w:spacing w:after="0"/>
-            </w:pPr>
-            <w:r>
-              <w:rPr>
-                <w:rFonts w:ascii="Times New Roman" w:hAnsi="Times New Roman"/>
-                <w:sz w:val="20"/>
-              </w:rPr>
-              <w:t>U.S. Environmental Protection Agency</w:t>
-            </w:r>
-          </w:p>
-        </w:tc>
-      </w:tr>
-      <w:tr>
-        <w:tc>
-          <w:tcPr>
-            <w:tcW w:type="dxa" w:w="4873"/>
-          </w:tcPr>
-          <w:p>
-            <w:pPr>
-              <w:spacing w:after="0"/>
-            </w:pPr>
-            <w:r>
-              <w:rPr>
-                <w:rFonts w:ascii="Times New Roman" w:hAnsi="Times New Roman"/>
-                <w:sz w:val="20"/>
-              </w:rPr>
-              <w:t>GRQA</w:t>
-            </w:r>
-          </w:p>
-        </w:tc>
-        <w:tc>
-          <w:tcPr>
-            <w:tcW w:type="dxa" w:w="4873"/>
-          </w:tcPr>
-          <w:p>
-            <w:pPr>
-              <w:spacing w:after="0"/>
-            </w:pPr>
-            <w:r>
-              <w:rPr>
-                <w:rFonts w:ascii="Times New Roman" w:hAnsi="Times New Roman"/>
-                <w:sz w:val="20"/>
-              </w:rPr>
-              <w:t>Global River Quality Archive</w:t>
-            </w:r>
-          </w:p>
-        </w:tc>
-      </w:tr>
-      <w:tr>
-        <w:tc>
-          <w:tcPr>
-            <w:tcW w:type="dxa" w:w="4873"/>
-          </w:tcPr>
-          <w:p>
-            <w:pPr>
-              <w:spacing w:after="0"/>
-            </w:pPr>
-            <w:r>
-              <w:rPr>
-                <w:rFonts w:ascii="Times New Roman" w:hAnsi="Times New Roman"/>
-                <w:sz w:val="20"/>
-              </w:rPr>
-              <w:t>HAB</w:t>
-            </w:r>
-          </w:p>
-        </w:tc>
-        <w:tc>
-          <w:tcPr>
-            <w:tcW w:type="dxa" w:w="4873"/>
-          </w:tcPr>
-          <w:p>
-            <w:pPr>
-              <w:spacing w:after="0"/>
-            </w:pPr>
-            <w:r>
-              <w:rPr>
-                <w:rFonts w:ascii="Times New Roman" w:hAnsi="Times New Roman"/>
-                <w:sz w:val="20"/>
-              </w:rPr>
-              <w:t>Harmful Algal Bloom</w:t>
-            </w:r>
-          </w:p>
-        </w:tc>
-      </w:tr>
-      <w:tr>
-        <w:tc>
-          <w:tcPr>
-            <w:tcW w:type="dxa" w:w="4873"/>
-          </w:tcPr>
-          <w:p>
-            <w:pPr>
-              <w:spacing w:after="0"/>
-            </w:pPr>
-            <w:r>
-              <w:rPr>
-                <w:rFonts w:ascii="Times New Roman" w:hAnsi="Times New Roman"/>
-                <w:sz w:val="20"/>
-              </w:rPr>
-              <w:t>MI</w:t>
-            </w:r>
-          </w:p>
-        </w:tc>
-        <w:tc>
-          <w:tcPr>
-            <w:tcW w:type="dxa" w:w="4873"/>
-          </w:tcPr>
-          <w:p>
-            <w:pPr>
-              <w:spacing w:after="0"/>
-            </w:pPr>
-            <w:r>
-              <w:rPr>
-                <w:rFonts w:ascii="Times New Roman" w:hAnsi="Times New Roman"/>
-                <w:sz w:val="20"/>
-              </w:rPr>
-              <w:t>Mutual Information</w:t>
-            </w:r>
-          </w:p>
-        </w:tc>
-      </w:tr>
-      <w:tr>
-        <w:tc>
-          <w:tcPr>
-            <w:tcW w:type="dxa" w:w="4873"/>
-          </w:tcPr>
-          <w:p>
-            <w:pPr>
-              <w:spacing w:after="0"/>
-            </w:pPr>
-            <w:r>
-              <w:rPr>
-                <w:rFonts w:ascii="Times New Roman" w:hAnsi="Times New Roman"/>
-                <w:sz w:val="20"/>
-              </w:rPr>
-              <w:t>NEON</w:t>
-            </w:r>
-          </w:p>
-        </w:tc>
-        <w:tc>
-          <w:tcPr>
-            <w:tcW w:type="dxa" w:w="4873"/>
-          </w:tcPr>
-          <w:p>
-            <w:pPr>
-              <w:spacing w:after="0"/>
-            </w:pPr>
-            <w:r>
-              <w:rPr>
-                <w:rFonts w:ascii="Times New Roman" w:hAnsi="Times New Roman"/>
-                <w:sz w:val="20"/>
-              </w:rPr>
-              <w:t>National Ecological Observatory Network</w:t>
-            </w:r>
-          </w:p>
-        </w:tc>
-      </w:tr>
-      <w:tr>
-        <w:tc>
-          <w:tcPr>
-            <w:tcW w:type="dxa" w:w="4873"/>
-          </w:tcPr>
-          <w:p>
-            <w:pPr>
-              <w:spacing w:after="0"/>
-            </w:pPr>
-            <w:r>
-              <w:rPr>
-                <w:rFonts w:ascii="Times New Roman" w:hAnsi="Times New Roman"/>
-                <w:sz w:val="20"/>
-              </w:rPr>
-              <w:t>PCMCI</w:t>
-            </w:r>
-          </w:p>
-        </w:tc>
-        <w:tc>
-          <w:tcPr>
-            <w:tcW w:type="dxa" w:w="4873"/>
-          </w:tcPr>
-          <w:p>
-            <w:pPr>
-              <w:spacing w:after="0"/>
-            </w:pPr>
-            <w:r>
-              <w:rPr>
-                <w:rFonts w:ascii="Times New Roman" w:hAnsi="Times New Roman"/>
-                <w:sz w:val="20"/>
-              </w:rPr>
-              <w:t>Peter and Clark Momentary Conditional Independence</w:t>
-            </w:r>
-          </w:p>
-        </w:tc>
-      </w:tr>
-      <w:tr>
-        <w:tc>
-          <w:tcPr>
-            <w:tcW w:type="dxa" w:w="4873"/>
-          </w:tcPr>
-          <w:p>
-            <w:pPr>
-              <w:spacing w:after="0"/>
-            </w:pPr>
-            <w:r>
-              <w:rPr>
-                <w:rFonts w:ascii="Times New Roman" w:hAnsi="Times New Roman"/>
-                <w:sz w:val="20"/>
-              </w:rPr>
-              <w:t>SSM</w:t>
-            </w:r>
-          </w:p>
-        </w:tc>
-        <w:tc>
-          <w:tcPr>
-            <w:tcW w:type="dxa" w:w="4873"/>
-          </w:tcPr>
-          <w:p>
-            <w:pPr>
-              <w:spacing w:after="0"/>
-            </w:pPr>
-            <w:r>
-              <w:rPr>
-                <w:rFonts w:ascii="Times New Roman" w:hAnsi="Times New Roman"/>
-                <w:sz w:val="20"/>
-              </w:rPr>
-              <w:t>State Space Model</w:t>
-            </w:r>
-          </w:p>
-        </w:tc>
-      </w:tr>
-      <w:tr>
-        <w:tc>
-          <w:tcPr>
-            <w:tcW w:type="dxa" w:w="4873"/>
-          </w:tcPr>
-          <w:p>
-            <w:pPr>
-              <w:spacing w:after="0"/>
-            </w:pPr>
-            <w:r>
-              <w:rPr>
-                <w:rFonts w:ascii="Times New Roman" w:hAnsi="Times New Roman"/>
-                <w:sz w:val="20"/>
-              </w:rPr>
-              <w:t>USGS</w:t>
-            </w:r>
-          </w:p>
-        </w:tc>
-        <w:tc>
-          <w:tcPr>
-            <w:tcW w:type="dxa" w:w="4873"/>
-          </w:tcPr>
-          <w:p>
-            <w:pPr>
-              <w:spacing w:after="0"/>
-            </w:pPr>
-            <w:r>
-              <w:rPr>
-                <w:rFonts w:ascii="Times New Roman" w:hAnsi="Times New Roman"/>
-                <w:sz w:val="20"/>
-              </w:rPr>
-              <w:t>U.S. Geological Survey</w:t>
-            </w:r>
-          </w:p>
-        </w:tc>
-      </w:tr>
-      <w:tr>
-        <w:tc>
-          <w:tcPr>
-            <w:tcW w:type="dxa" w:w="4873"/>
-          </w:tcPr>
-          <w:p>
-            <w:pPr>
-              <w:spacing w:after="0"/>
-            </w:pPr>
-            <w:r>
-              <w:rPr>
-                <w:rFonts w:ascii="Times New Roman" w:hAnsi="Times New Roman"/>
-                <w:sz w:val="20"/>
-              </w:rPr>
-              <w:t>ViT</w:t>
-            </w:r>
-          </w:p>
-        </w:tc>
-        <w:tc>
-          <w:tcPr>
-            <w:tcW w:type="dxa" w:w="4873"/>
-          </w:tcPr>
-          <w:p>
-            <w:pPr>
-              <w:spacing w:after="0"/>
-            </w:pPr>
-            <w:r>
-              <w:rPr>
-                <w:rFonts w:ascii="Times New Roman" w:hAnsi="Times New Roman"/>
-                <w:sz w:val="20"/>
-              </w:rPr>
-              <w:t>Vision Transformer</w:t>
-            </w:r>
-          </w:p>
-        </w:tc>
-      </w:tr>
-      <w:tr>
-        <w:tc>
-          <w:tcPr>
-            <w:tcW w:type="dxa" w:w="4873"/>
-          </w:tcPr>
-          <w:p>
-            <w:pPr>
-              <w:spacing w:after="0"/>
-            </w:pPr>
-            <w:r>
-              <w:rPr>
-                <w:rFonts w:ascii="Times New Roman" w:hAnsi="Times New Roman"/>
-                <w:sz w:val="20"/>
-              </w:rPr>
-              <w:t>WQ</w:t>
-            </w:r>
-          </w:p>
-        </w:tc>
-        <w:tc>
-          <w:tcPr>
-            <w:tcW w:type="dxa" w:w="4873"/>
-          </w:tcPr>
-          <w:p>
-            <w:pPr>
-              <w:spacing w:after="0"/>
-            </w:pPr>
-            <w:r>
-              <w:rPr>
-                <w:rFonts w:ascii="Times New Roman" w:hAnsi="Times New Roman"/>
-                <w:sz w:val="20"/>
-              </w:rPr>
-              <w:t>Water Quality</w:t>
-            </w:r>
-          </w:p>
-        </w:tc>
-      </w:tr>
-    </w:tbl>
+    <w:p>
+      <w:r>
+        <w:t>AI (Artificial Intelligence), AUROC (Area Under the Receiver Operating Characteristic Curve), CI (Confidence Interval), CKA (Centered Kernel Alignment), CLR (Centered Log-Ratio), DO (Dissolved Oxygen), ECE (Expected Calibration Error), eDNA (Environmental DNA), EMP (Earth Microbiome Project), EPA (U.S. Environmental Protection Agency), GRQA (Global River Quality Archive), HAB (Harmful Algal Bloom), MAE (Masked Autoencoder), MI (Mutual Information), NEON (National Ecological Observatory Network), PCMCI (Peter and Clark Momentary Conditional Independence), SSM (State Space Model), TP (Total Phosphorus), USGS (U.S. Geological Survey), ViT (Vision Transformer), WQ (Water Quality).</w:t>
+      </w:r>
+    </w:p>
     <w:p>
       <w:pPr>
         <w:pStyle w:val="Heading1"/>
@@ -885,7 +310,7 @@
     </w:p>
     <w:p>
       <w:r>
-        <w:t>On April 25, 2014, the City of Flint, Michigan switched its drinking water source to the Flint River without adequate corrosion control treatment. Over the next 18 months, 100,000 residents were exposed to dangerously elevated lead levels—yet state and federal agencies did not officially acknowledge the contamination until October 2015 [1]. The Flint crisis is not an isolated failure: the 2015 Gold King Mine spill released 3 million gallons of toxic wastewater into the Animas River before anyone detected the orange plume, and the 2023 East Palestine train derailment contaminated waterways with vinyl chloride while monitoring systems remained silent for hours [2]. Even EPA-documented contamination events are frequently detected only after damage has already occurred.</w:t>
+        <w:t>In 2014, the City of Flint, Michigan switched its water source without adequate treatment. Over 18 months, 100,000 residents were exposed to lead—yet agencies did not acknowledge the contamination until October 2015 [1]. The Flint crisis is not isolated: the 2015 Gold King Mine spill released 3 million gallons of toxic wastewater undetected, and the 2023 East Palestine derailment contaminated waterways while monitoring systems remained silent [2]. Even EPA-documented events are frequently detected only after damage has occurred.</w:t>
       </w:r>
     </w:p>
     <w:p>
@@ -895,17 +320,20 @@
     </w:p>
     <w:p>
       <w:r>
-        <w:t>Biology already runs a better detection system. When a waterway is polluted, organisms respond at multiple timescales: fish alter swimming behavior within minutes [4], dissolved oxygen shifts within hours, microbial communities reorganize over days [5], and satellite-observable properties change over weeks [6]. Each channel provides different sensitivity–specificity tradeoffs for different contaminant types.</w:t>
+        <w:t>Biology already runs a better detection system. Organisms respond at multiple timescales: fish alter behavior within minutes [4], dissolved oxygen shifts within hours, microbial communities reorganize over days [5], and satellite-observable properties change over weeks [6]. No existing system integrates these diverse signals. Prior AI focuses on single modalities—satellite WQ prediction [6], sensor foundation models [3], statistical biomonitors [4]—each with blind spots. None provide uncertainty quantification or coverage guarantees for regulatory adoption.</w:t>
       </w:r>
     </w:p>
     <w:p>
       <w:r>
-        <w:t>No existing system integrates these diverse signals. Prior AI for water quality focuses on single modalities: satellite-based WQ prediction [6], sensor time series foundation models [3], and statistical behavioral biomonitors [4]. These approaches face fundamental limitations: satellite models cannot detect optically-invisible pollutants, sensor networks miss contaminants between stations, and commercial Daphnia toximeters use fixed thresholds without learned representations. None provide uncertainty quantification or coverage guarantees—prerequisites for regulatory adoption.</w:t>
+        <w:t>SENTINEL addresses this gap by fusing five environmental sensing modalities through a unified AI framework. The key insight is that different modalities respond to different contaminants at different timescales, and joint reasoning across all of them detects contamination earlier than any single modality alone.</w:t>
       </w:r>
     </w:p>
     <w:p>
       <w:r>
-        <w:t>SENTINEL addresses this gap by fusing five environmental sensing modalities through a unified AI framework. The key insight is that different modalities respond to different contaminants at different timescales, and joint reasoning across all of them detects contamination earlier than any single modality alone. This project makes six contributions:</w:t>
+        <w:rPr>
+          <w:b/>
+        </w:rPr>
+        <w:t>This project makes six contributions:</w:t>
       </w:r>
     </w:p>
     <w:p>
@@ -916,10 +344,10 @@
         <w:rPr>
           <w:b/>
         </w:rPr>
-        <w:t xml:space="preserve">SENTINEL-DB: </w:t>
+        <w:t>SENTINEL-DB:</w:t>
       </w:r>
       <w:r>
-        <w:t>The largest multimodal water quality dataset ever assembled—390 million records from 13 public data sources spanning 105 countries.</w:t>
+        <w:t xml:space="preserve"> The largest multimodal water quality dataset ever assembled—390 million records from 13 public data sources spanning 105 countries.</w:t>
       </w:r>
     </w:p>
     <w:p>
@@ -930,10 +358,10 @@
         <w:rPr>
           <w:b/>
         </w:rPr>
-        <w:t xml:space="preserve">Five novel encoder architectures: </w:t>
+        <w:t>Five novel encoder architectures:</w:t>
       </w:r>
       <w:r>
-        <w:t>Each designed for its modality’s unique data characteristics, with all results validated by bootstrap 95% confidence intervals.</w:t>
+        <w:t xml:space="preserve"> Each designed for its modality’s unique data characteristics, outperforming published SOTA where benchmarks exist (AquaSSM vs. MCN-LSTM, BioMotion vs. Deep Autoencoder, HydroViT vs. DenseNet121/HydroVision), with all results validated by bootstrap 95% confidence intervals.</w:t>
       </w:r>
     </w:p>
     <w:p>
@@ -944,10 +372,10 @@
         <w:rPr>
           <w:b/>
         </w:rPr>
-        <w:t xml:space="preserve">SENTINEL-Fusion: </w:t>
+        <w:t>SENTINEL-Fusion:</w:t>
       </w:r>
       <w:r>
-        <w:t>A Perceiver IO-derived cross-modal temporal attention framework that achieves AUROC = 0.973 [0.964–0.981] and detects contamination events with calibrated uncertainty (ECE = 0.086).</w:t>
+        <w:t xml:space="preserve"> A Perceiver IO-derived cross-modal temporal attention framework that achieves AUROC = 0.939 [0.922–0.956] and detects contamination events with calibrated uncertainty (ECE = 0.086).</w:t>
       </w:r>
     </w:p>
     <w:p>
@@ -958,10 +386,10 @@
         <w:rPr>
           <w:b/>
         </w:rPr>
-        <w:t xml:space="preserve">Real-world event validation: </w:t>
+        <w:t>Real-data event validation:</w:t>
       </w:r>
       <w:r>
-        <w:t>10 of 10 contamination events detected before official reports, including 6 real NEON sensor events detected 18 days before routine monitoring.</w:t>
+        <w:t xml:space="preserve"> 6 major contamination events detected on real downloaded USGS sensor data with mean lead time of 66 days, plus 6 real NEON events and 21 research-validated events spanning HABs, hypoxia, salinity intrusion, and agricultural runoff.</w:t>
       </w:r>
     </w:p>
     <w:p>
@@ -972,10 +400,10 @@
         <w:rPr>
           <w:b/>
         </w:rPr>
-        <w:t xml:space="preserve">Mathematical safety guarantees: </w:t>
+        <w:t>Mathematical safety guarantees:</w:t>
       </w:r>
       <w:r>
-        <w:t>Conformal prediction provides distribution-free coverage guarantees (≥0.95) validated on 13,202 real encoder embeddings.</w:t>
+        <w:t xml:space="preserve"> Conformal prediction provides distribution-free coverage guarantees (≥0.95) validated on 13,202 real encoder embeddings.</w:t>
       </w:r>
     </w:p>
     <w:p>
@@ -986,10 +414,15 @@
         <w:rPr>
           <w:b/>
         </w:rPr>
-        <w:t xml:space="preserve">Actionable deployment tools: </w:t>
+        <w:t>Actionable deployment tools:</w:t>
       </w:r>
       <w:r>
-        <w:t>A composite risk index ranking 32 NEON sites, causal pollution pathway discovery, and cost-optimal sensor placement starting at $0.50/site/year.</w:t>
+        <w:t xml:space="preserve"> A composite risk index ranking 32 NEON sites, causal pollution pathway discovery, and cost-optimal sensor placement starting at $0.50/site/year.</w:t>
+      </w:r>
+    </w:p>
+    <w:p>
+      <w:r>
+        <w:t>The urgency of this work reflects a global crisis. According to WHO/UNICEF, 2 billion people worldwide still lack access to safely managed drinking water services, and 1.2 billion lack even basic service [18]. In the United States alone, waterborne disease outbreaks and contamination events impose an estimated $4.3 billion in annual healthcare costs, encompassing emergency treatment, long-term neurological damage from lead exposure, and chronic gastrointestinal illness from microbial contamination. The Flint crisis alone cost over $600 million in infrastructure replacement and medical monitoring—costs that an early warning system could have dramatically reduced by triggering intervention within weeks rather than years. Globally, the World Bank estimates that water pollution reduces economic growth by up to one-third in heavily affected regions. Current monitoring paradigms detect contamination only after regulatory thresholds are exceeded, creating an inherent delay between pollution onset and public health response. AI-based early warning systems like SENTINEL fundamentally shift this paradigm from reactive detection to predictive intervention, potentially reducing human exposure time from months to days and avoiding the cascading health, economic, and environmental costs of delayed response.</w:t>
       </w:r>
     </w:p>
     <w:p>
@@ -1010,7 +443,7 @@
     </w:p>
     <w:p>
       <w:r>
-        <w:t>SENTINEL-DB consolidates 13 publicly available environmental data sources into the largest multimodal water quality dataset assembled (Table 1). All data sources are publicly accessible and freely available, ensuring full reproducibility.</w:t>
+        <w:t>SENTINEL-DB consolidates 13 publicly available environmental data sources into the largest multimodal water quality dataset assembled (Table 1).</w:t>
       </w:r>
     </w:p>
     <w:tbl>
@@ -1021,15 +454,15 @@
         <w:tblLook w:firstColumn="1" w:firstRow="1" w:lastColumn="0" w:lastRow="0" w:noHBand="0" w:noVBand="1" w:val="04A0"/>
       </w:tblPr>
       <w:tblGrid>
-        <w:gridCol w:w="2436"/>
-        <w:gridCol w:w="2436"/>
-        <w:gridCol w:w="2436"/>
-        <w:gridCol w:w="2436"/>
+        <w:gridCol w:w="2520"/>
+        <w:gridCol w:w="2520"/>
+        <w:gridCol w:w="2520"/>
+        <w:gridCol w:w="2520"/>
       </w:tblGrid>
       <w:tr>
         <w:tc>
           <w:tcPr>
-            <w:tcW w:type="dxa" w:w="2436"/>
+            <w:tcW w:type="dxa" w:w="2520"/>
             <w:shd w:fill="D9E2F3"/>
           </w:tcPr>
           <w:p>
@@ -1044,7 +477,7 @@
         </w:tc>
         <w:tc>
           <w:tcPr>
-            <w:tcW w:type="dxa" w:w="2436"/>
+            <w:tcW w:type="dxa" w:w="2520"/>
             <w:shd w:fill="D9E2F3"/>
           </w:tcPr>
           <w:p>
@@ -1059,7 +492,7 @@
         </w:tc>
         <w:tc>
           <w:tcPr>
-            <w:tcW w:type="dxa" w:w="2436"/>
+            <w:tcW w:type="dxa" w:w="2520"/>
             <w:shd w:fill="D9E2F3"/>
           </w:tcPr>
           <w:p>
@@ -1074,7 +507,7 @@
         </w:tc>
         <w:tc>
           <w:tcPr>
-            <w:tcW w:type="dxa" w:w="2436"/>
+            <w:tcW w:type="dxa" w:w="2520"/>
             <w:shd w:fill="D9E2F3"/>
           </w:tcPr>
           <w:p>
@@ -1091,7 +524,7 @@
       <w:tr>
         <w:tc>
           <w:tcPr>
-            <w:tcW w:type="dxa" w:w="2436"/>
+            <w:tcW w:type="dxa" w:w="2520"/>
           </w:tcPr>
           <w:p>
             <w:pPr>
@@ -1108,7 +541,7 @@
         </w:tc>
         <w:tc>
           <w:tcPr>
-            <w:tcW w:type="dxa" w:w="2436"/>
+            <w:tcW w:type="dxa" w:w="2520"/>
           </w:tcPr>
           <w:p>
             <w:pPr>
@@ -1125,7 +558,7 @@
         </w:tc>
         <w:tc>
           <w:tcPr>
-            <w:tcW w:type="dxa" w:w="2436"/>
+            <w:tcW w:type="dxa" w:w="2520"/>
           </w:tcPr>
           <w:p>
             <w:pPr>
@@ -1142,7 +575,7 @@
         </w:tc>
         <w:tc>
           <w:tcPr>
-            <w:tcW w:type="dxa" w:w="2436"/>
+            <w:tcW w:type="dxa" w:w="2520"/>
           </w:tcPr>
           <w:p>
             <w:pPr>
@@ -1161,7 +594,7 @@
       <w:tr>
         <w:tc>
           <w:tcPr>
-            <w:tcW w:type="dxa" w:w="2436"/>
+            <w:tcW w:type="dxa" w:w="2520"/>
           </w:tcPr>
           <w:p>
             <w:pPr>
@@ -1178,7 +611,7 @@
         </w:tc>
         <w:tc>
           <w:tcPr>
-            <w:tcW w:type="dxa" w:w="2436"/>
+            <w:tcW w:type="dxa" w:w="2520"/>
           </w:tcPr>
           <w:p>
             <w:pPr>
@@ -1195,7 +628,7 @@
         </w:tc>
         <w:tc>
           <w:tcPr>
-            <w:tcW w:type="dxa" w:w="2436"/>
+            <w:tcW w:type="dxa" w:w="2520"/>
           </w:tcPr>
           <w:p>
             <w:pPr>
@@ -1212,7 +645,7 @@
         </w:tc>
         <w:tc>
           <w:tcPr>
-            <w:tcW w:type="dxa" w:w="2436"/>
+            <w:tcW w:type="dxa" w:w="2520"/>
           </w:tcPr>
           <w:p>
             <w:pPr>
@@ -1231,7 +664,7 @@
       <w:tr>
         <w:tc>
           <w:tcPr>
-            <w:tcW w:type="dxa" w:w="2436"/>
+            <w:tcW w:type="dxa" w:w="2520"/>
           </w:tcPr>
           <w:p>
             <w:pPr>
@@ -1248,7 +681,7 @@
         </w:tc>
         <w:tc>
           <w:tcPr>
-            <w:tcW w:type="dxa" w:w="2436"/>
+            <w:tcW w:type="dxa" w:w="2520"/>
           </w:tcPr>
           <w:p>
             <w:pPr>
@@ -1265,7 +698,7 @@
         </w:tc>
         <w:tc>
           <w:tcPr>
-            <w:tcW w:type="dxa" w:w="2436"/>
+            <w:tcW w:type="dxa" w:w="2520"/>
           </w:tcPr>
           <w:p>
             <w:pPr>
@@ -1282,7 +715,7 @@
         </w:tc>
         <w:tc>
           <w:tcPr>
-            <w:tcW w:type="dxa" w:w="2436"/>
+            <w:tcW w:type="dxa" w:w="2520"/>
           </w:tcPr>
           <w:p>
             <w:pPr>
@@ -1301,7 +734,7 @@
       <w:tr>
         <w:tc>
           <w:tcPr>
-            <w:tcW w:type="dxa" w:w="2436"/>
+            <w:tcW w:type="dxa" w:w="2520"/>
           </w:tcPr>
           <w:p>
             <w:pPr>
@@ -1318,7 +751,7 @@
         </w:tc>
         <w:tc>
           <w:tcPr>
-            <w:tcW w:type="dxa" w:w="2436"/>
+            <w:tcW w:type="dxa" w:w="2520"/>
           </w:tcPr>
           <w:p>
             <w:pPr>
@@ -1335,7 +768,7 @@
         </w:tc>
         <w:tc>
           <w:tcPr>
-            <w:tcW w:type="dxa" w:w="2436"/>
+            <w:tcW w:type="dxa" w:w="2520"/>
           </w:tcPr>
           <w:p>
             <w:pPr>
@@ -1352,7 +785,7 @@
         </w:tc>
         <w:tc>
           <w:tcPr>
-            <w:tcW w:type="dxa" w:w="2436"/>
+            <w:tcW w:type="dxa" w:w="2520"/>
           </w:tcPr>
           <w:p>
             <w:pPr>
@@ -1371,7 +804,7 @@
       <w:tr>
         <w:tc>
           <w:tcPr>
-            <w:tcW w:type="dxa" w:w="2436"/>
+            <w:tcW w:type="dxa" w:w="2520"/>
           </w:tcPr>
           <w:p>
             <w:pPr>
@@ -1388,7 +821,7 @@
         </w:tc>
         <w:tc>
           <w:tcPr>
-            <w:tcW w:type="dxa" w:w="2436"/>
+            <w:tcW w:type="dxa" w:w="2520"/>
           </w:tcPr>
           <w:p>
             <w:pPr>
@@ -1405,7 +838,7 @@
         </w:tc>
         <w:tc>
           <w:tcPr>
-            <w:tcW w:type="dxa" w:w="2436"/>
+            <w:tcW w:type="dxa" w:w="2520"/>
           </w:tcPr>
           <w:p>
             <w:pPr>
@@ -1422,7 +855,7 @@
         </w:tc>
         <w:tc>
           <w:tcPr>
-            <w:tcW w:type="dxa" w:w="2436"/>
+            <w:tcW w:type="dxa" w:w="2520"/>
           </w:tcPr>
           <w:p>
             <w:pPr>
@@ -1441,7 +874,7 @@
       <w:tr>
         <w:tc>
           <w:tcPr>
-            <w:tcW w:type="dxa" w:w="2436"/>
+            <w:tcW w:type="dxa" w:w="2520"/>
           </w:tcPr>
           <w:p>
             <w:pPr>
@@ -1458,7 +891,7 @@
         </w:tc>
         <w:tc>
           <w:tcPr>
-            <w:tcW w:type="dxa" w:w="2436"/>
+            <w:tcW w:type="dxa" w:w="2520"/>
           </w:tcPr>
           <w:p>
             <w:pPr>
@@ -1475,7 +908,7 @@
         </w:tc>
         <w:tc>
           <w:tcPr>
-            <w:tcW w:type="dxa" w:w="2436"/>
+            <w:tcW w:type="dxa" w:w="2520"/>
           </w:tcPr>
           <w:p>
             <w:pPr>
@@ -1492,7 +925,7 @@
         </w:tc>
         <w:tc>
           <w:tcPr>
-            <w:tcW w:type="dxa" w:w="2436"/>
+            <w:tcW w:type="dxa" w:w="2520"/>
           </w:tcPr>
           <w:p>
             <w:pPr>
@@ -1511,7 +944,7 @@
       <w:tr>
         <w:tc>
           <w:tcPr>
-            <w:tcW w:type="dxa" w:w="2436"/>
+            <w:tcW w:type="dxa" w:w="2520"/>
           </w:tcPr>
           <w:p>
             <w:pPr>
@@ -1528,7 +961,7 @@
         </w:tc>
         <w:tc>
           <w:tcPr>
-            <w:tcW w:type="dxa" w:w="2436"/>
+            <w:tcW w:type="dxa" w:w="2520"/>
           </w:tcPr>
           <w:p>
             <w:pPr>
@@ -1545,7 +978,7 @@
         </w:tc>
         <w:tc>
           <w:tcPr>
-            <w:tcW w:type="dxa" w:w="2436"/>
+            <w:tcW w:type="dxa" w:w="2520"/>
           </w:tcPr>
           <w:p>
             <w:pPr>
@@ -1562,7 +995,7 @@
         </w:tc>
         <w:tc>
           <w:tcPr>
-            <w:tcW w:type="dxa" w:w="2436"/>
+            <w:tcW w:type="dxa" w:w="2520"/>
           </w:tcPr>
           <w:p>
             <w:pPr>
@@ -1581,7 +1014,7 @@
       <w:tr>
         <w:tc>
           <w:tcPr>
-            <w:tcW w:type="dxa" w:w="2436"/>
+            <w:tcW w:type="dxa" w:w="2520"/>
           </w:tcPr>
           <w:p>
             <w:pPr>
@@ -1598,7 +1031,7 @@
         </w:tc>
         <w:tc>
           <w:tcPr>
-            <w:tcW w:type="dxa" w:w="2436"/>
+            <w:tcW w:type="dxa" w:w="2520"/>
           </w:tcPr>
           <w:p>
             <w:pPr>
@@ -1615,7 +1048,7 @@
         </w:tc>
         <w:tc>
           <w:tcPr>
-            <w:tcW w:type="dxa" w:w="2436"/>
+            <w:tcW w:type="dxa" w:w="2520"/>
           </w:tcPr>
           <w:p>
             <w:pPr>
@@ -1632,7 +1065,7 @@
         </w:tc>
         <w:tc>
           <w:tcPr>
-            <w:tcW w:type="dxa" w:w="2436"/>
+            <w:tcW w:type="dxa" w:w="2520"/>
           </w:tcPr>
           <w:p>
             <w:pPr>
@@ -1651,7 +1084,7 @@
       <w:tr>
         <w:tc>
           <w:tcPr>
-            <w:tcW w:type="dxa" w:w="2436"/>
+            <w:tcW w:type="dxa" w:w="2520"/>
           </w:tcPr>
           <w:p>
             <w:pPr>
@@ -1668,7 +1101,7 @@
         </w:tc>
         <w:tc>
           <w:tcPr>
-            <w:tcW w:type="dxa" w:w="2436"/>
+            <w:tcW w:type="dxa" w:w="2520"/>
           </w:tcPr>
           <w:p>
             <w:pPr>
@@ -1685,7 +1118,7 @@
         </w:tc>
         <w:tc>
           <w:tcPr>
-            <w:tcW w:type="dxa" w:w="2436"/>
+            <w:tcW w:type="dxa" w:w="2520"/>
           </w:tcPr>
           <w:p>
             <w:pPr>
@@ -1702,7 +1135,7 @@
         </w:tc>
         <w:tc>
           <w:tcPr>
-            <w:tcW w:type="dxa" w:w="2436"/>
+            <w:tcW w:type="dxa" w:w="2520"/>
           </w:tcPr>
           <w:p>
             <w:pPr>
@@ -1737,7 +1170,12 @@
     </w:p>
     <w:p>
       <w:r>
-        <w:t>NEON contributes the majority of records (351.7 million rows of continuous sonde measurements at 15-minute resolution), providing the high-frequency temporal coverage essential for detecting rapid-onset anomalies. GRQA provides the broadest geographic diversity with 18 million harmonized river quality records across 105 countries and 22 water quality parameters [7]. Harmonizing these sources required resolving differences in temporal resolution (15 minutes to monthly), spatial scale (point stations to 10-meter pixels), units, quality flags, and detection limits. The processing pipeline applies source-specific quality control filters, standardizes units to SI, aligns timestamps to UTC, and constructs co-registered training pairs where modalities overlap spatially and temporally.</w:t>
+        <w:t>All data sources are publicly accessible. NEON contributes the majority (351.7M rows of continuous sonde data at 15-minute resolution); GRQA provides geographic diversity (18M records, 94K sites, 105 countries) [7]; Sentinel-2 L2A provides spatially continuous observations every 5 days. Harmonizing required resolving differences in temporal resolution (15 min to monthly), spatial scale (point stations to 10 m pixels), units, and quality flags. The pipeline applies source-specific QC, standardizes to SI/UTC, and constructs co-registered training pairs.</w:t>
+      </w:r>
+    </w:p>
+    <w:p>
+      <w:r>
+        <w:t>Constructing SENTINEL-DB required overcoming four major data harmonization challenges. First, temporal resolution mismatch: NEON sondes report every 15 minutes (96 readings per day), USGS NWIS provides instantaneous values at 15-minute to hourly intervals, EPA WQP contains grab samples at weekly to monthly frequency, and Sentinel-2 revisits every 5 days with cloud-dependent gaps. Aligning these required interpolation for sensor data (forward-fill with exponential decay weighting) and temporal binning for satellite-sensor co-registration (matching the closest cloud-free overpass within a 48-hour window to in-situ measurements). Second, spatial scale differences: point-based sensor stations measure water quality at a single location, while Sentinel-2 pixels represent 10-meter ground cells and EMP 16S samples integrate microbial communities over variable collection volumes. Co-registration used geographic buffering (500 m radius for sensor-satellite pairs, watershed-level matching for microbial samples). Third, missing data handling: across 390 million records, approximately 12% contained at least one missing parameter. Rather than imputing missing values—which could introduce artificial patterns—the pipeline flags gaps and the fusion module handles missing modalities through confidence-weighted gating with renormalization at inference time. Fourth, quality control: each source required specific QC steps—NEON data was filtered by the finalQF flag (retaining only QF-passed records), USGS records were screened for instrument drift using rolling standard deviation thresholds, and EMP samples were rarefied to 10,000 reads to normalize sequencing depth. This four-stage pipeline—temporal alignment, spatial co-registration, missingness flagging, and source-specific QC—ensures that the training data reflects genuine environmental variation rather than measurement artifacts.</w:t>
       </w:r>
     </w:p>
     <w:p>
@@ -1750,59 +1188,7 @@
     </w:p>
     <w:p>
       <w:r>
-        <w:t>Each sensing modality requires a specialized neural architecture (Figure 1). All encoders produce 256-dimensional embeddings for cross-modal fusion. Total system: 223.1M parameters trained on a single NVIDIA RTX 4060 (8 GB) in ~72 hours.</w:t>
-      </w:r>
-    </w:p>
-    <w:p>
-      <w:pPr>
-        <w:jc w:val="center"/>
-      </w:pPr>
-      <w:r>
-        <w:drawing>
-          <wp:inline xmlns:a="http://schemas.openxmlformats.org/drawingml/2006/main" xmlns:pic="http://schemas.openxmlformats.org/drawingml/2006/picture">
-            <wp:extent cx="5029200" cy="3361182"/>
-            <wp:docPr id="1" name="Picture 1"/>
-            <wp:cNvGraphicFramePr>
-              <a:graphicFrameLocks noChangeAspect="1"/>
-            </wp:cNvGraphicFramePr>
-            <a:graphic>
-              <a:graphicData uri="http://schemas.openxmlformats.org/drawingml/2006/picture">
-                <pic:pic>
-                  <pic:nvPicPr>
-                    <pic:cNvPr id="0" name="fig6_system_architecture.jpg"/>
-                    <pic:cNvPicPr/>
-                  </pic:nvPicPr>
-                  <pic:blipFill>
-                    <a:blip r:embed="rId9"/>
-                    <a:stretch>
-                      <a:fillRect/>
-                    </a:stretch>
-                  </pic:blipFill>
-                  <pic:spPr>
-                    <a:xfrm>
-                      <a:off x="0" y="0"/>
-                      <a:ext cx="5029200" cy="3361182"/>
-                    </a:xfrm>
-                    <a:prstGeom prst="rect"/>
-                  </pic:spPr>
-                </pic:pic>
-              </a:graphicData>
-            </a:graphic>
-          </wp:inline>
-        </w:drawing>
-      </w:r>
-    </w:p>
-    <w:p>
-      <w:pPr>
-        <w:spacing w:after="160"/>
-        <w:jc w:val="center"/>
-      </w:pPr>
-      <w:r>
-        <w:rPr>
-          <w:i/>
-          <w:sz w:val="18"/>
-        </w:rPr>
-        <w:t>Figure 1. SENTINEL system architecture. Five modality-specific encoders project heterogeneous environmental data into a shared 256-D embedding space. Perceiver IO fusion produces anomaly detection, source attribution, and cascade escalation outputs.</w:t>
+        <w:t>Each sensing modality requires a specialized neural architecture. SENTINEL’s pipeline operates in three stages: (1) five modality-specific encoders independently project their respective data types into a shared 256-dimensional embedding space; (2) a Perceiver IO fusion module with 64 learned latents performs cross-modal temporal attention across all available embeddings; and (3) four output heads produce calibrated anomaly probability, 8-class type classification, 8-class source attribution, and 5-tier cascade escalation. The total system comprises 223.1M parameters (189.5M encoders + 33.6M fusion), all trained on a single NVIDIA RTX 4060 (8 GB) in ~72 hours. The individual encoder architectures, each designed to address the unique data challenges of its modality, are described below.</w:t>
       </w:r>
     </w:p>
     <w:p>
@@ -1813,47 +1199,7 @@
         <w:t xml:space="preserve">AquaSSM (Sensor). </w:t>
       </w:r>
       <w:r>
-        <w:t>Environmental sensor data presents two challenges: irregular sampling intervals (maintenance gaps, telemetry failures) and multi-timescale dynamics (acute spills unfold over hours, eutrophication over months). AquaSSM addresses both with a continuous-time state space model [8] that parameterizes state transitions via matrix exponentials, naturally handling arbitrary time gaps. Eight parallel channels span timescales from 1 hour to 365 days: short channels capture rapid conductance spikes, long channels track seasonal oxygen decline. Trained on 291,855 real USGS NWIS sequences from 1,130 stations.</w:t>
-      </w:r>
-    </w:p>
-    <w:p>
-      <w:pPr>
-        <w:spacing w:before="80" w:after="80"/>
-        <w:jc w:val="center"/>
-      </w:pPr>
-      <w:r>
-        <w:drawing>
-          <wp:inline xmlns:a="http://schemas.openxmlformats.org/drawingml/2006/main" xmlns:pic="http://schemas.openxmlformats.org/drawingml/2006/picture">
-            <wp:extent cx="3657600" cy="431212"/>
-            <wp:docPr id="2" name="Picture 2"/>
-            <wp:cNvGraphicFramePr>
-              <a:graphicFrameLocks noChangeAspect="1"/>
-            </wp:cNvGraphicFramePr>
-            <a:graphic>
-              <a:graphicData uri="http://schemas.openxmlformats.org/drawingml/2006/picture">
-                <pic:pic>
-                  <pic:nvPicPr>
-                    <pic:cNvPr id="0" name="eq_aquassm.png"/>
-                    <pic:cNvPicPr/>
-                  </pic:nvPicPr>
-                  <pic:blipFill>
-                    <a:blip r:embed="rId10"/>
-                    <a:stretch>
-                      <a:fillRect/>
-                    </a:stretch>
-                  </pic:blipFill>
-                  <pic:spPr>
-                    <a:xfrm>
-                      <a:off x="0" y="0"/>
-                      <a:ext cx="3657600" cy="431212"/>
-                    </a:xfrm>
-                    <a:prstGeom prst="rect"/>
-                  </pic:spPr>
-                </pic:pic>
-              </a:graphicData>
-            </a:graphic>
-          </wp:inline>
-        </w:drawing>
+        <w:t>Environmental sensor data presents two challenges: irregular sampling intervals (maintenance gaps, telemetry failures) and multi-timescale dynamics (acute spills unfold over hours, eutrophication over months). AquaSSM addresses both with a continuous-time SSM [8] that parameterizes state transitions as h(t) = exp(A · Δt) h(t-1), naturally handling arbitrary time gaps. Eight parallel channels span 1 hour to 365 days: short channels capture rapid conductance spikes, long channels track seasonal oxygen decline. Trained on 291,855 real USGS NWIS sequences from 1,130 stations.</w:t>
       </w:r>
     </w:p>
     <w:p>
@@ -1864,7 +1210,7 @@
         <w:drawing>
           <wp:inline xmlns:a="http://schemas.openxmlformats.org/drawingml/2006/main" xmlns:pic="http://schemas.openxmlformats.org/drawingml/2006/picture">
             <wp:extent cx="4572000" cy="2491740"/>
-            <wp:docPr id="3" name="Picture 3"/>
+            <wp:docPr id="1" name="Picture 1"/>
             <wp:cNvGraphicFramePr>
               <a:graphicFrameLocks noChangeAspect="1"/>
             </wp:cNvGraphicFramePr>
@@ -1876,7 +1222,7 @@
                     <pic:cNvPicPr/>
                   </pic:nvPicPr>
                   <pic:blipFill>
-                    <a:blip r:embed="rId11"/>
+                    <a:blip r:embed="rId9"/>
                     <a:stretch>
                       <a:fillRect/>
                     </a:stretch>
@@ -1905,7 +1251,7 @@
           <w:i/>
           <w:sz w:val="18"/>
         </w:rPr>
-        <w:t>Figure 2a. AquaSSM encoder: 8 parallel CT-SSM channels (1h–365d) process irregularly-sampled multivariate sensor data into 256-D embeddings.</w:t>
+        <w:t>Figure 1a. AquaSSM sensor encoder. Eight parallel CT-SSM channels (1h–365d) process irregularly-sampled multi-parameter sensor data. Trained on 291,855 USGS sequences (AUROC = 0.939).</w:t>
       </w:r>
     </w:p>
     <w:p>
@@ -1916,47 +1262,7 @@
         <w:t xml:space="preserve">HydroViT (Satellite). </w:t>
       </w:r>
       <w:r>
-        <w:t>Satellite remote sensing fills spatial gaps between point sensors, but paired satellite–in-situ training data is scarce and many pollutants are optically invisible. HydroViT uses a two-phase pipeline: self-supervised MAE pretraining [10] on 2,986 Sentinel-2 patches (75% masking) learns general spectral representations without labels, followed by supervised fine-tuning on 4,202 co-registered pairs for 16 WQ parameters. The masked autoencoder objective forces the model to reconstruct missing spectral patches from context:</w:t>
-      </w:r>
-    </w:p>
-    <w:p>
-      <w:pPr>
-        <w:spacing w:before="80" w:after="80"/>
-        <w:jc w:val="center"/>
-      </w:pPr>
-      <w:r>
-        <w:drawing>
-          <wp:inline xmlns:a="http://schemas.openxmlformats.org/drawingml/2006/main" xmlns:pic="http://schemas.openxmlformats.org/drawingml/2006/picture">
-            <wp:extent cx="3657600" cy="431212"/>
-            <wp:docPr id="4" name="Picture 4"/>
-            <wp:cNvGraphicFramePr>
-              <a:graphicFrameLocks noChangeAspect="1"/>
-            </wp:cNvGraphicFramePr>
-            <a:graphic>
-              <a:graphicData uri="http://schemas.openxmlformats.org/drawingml/2006/picture">
-                <pic:pic>
-                  <pic:nvPicPr>
-                    <pic:cNvPr id="0" name="eq_hydrovit.png"/>
-                    <pic:cNvPicPr/>
-                  </pic:nvPicPr>
-                  <pic:blipFill>
-                    <a:blip r:embed="rId12"/>
-                    <a:stretch>
-                      <a:fillRect/>
-                    </a:stretch>
-                  </pic:blipFill>
-                  <pic:spPr>
-                    <a:xfrm>
-                      <a:off x="0" y="0"/>
-                      <a:ext cx="3657600" cy="431212"/>
-                    </a:xfrm>
-                    <a:prstGeom prst="rect"/>
-                  </pic:spPr>
-                </pic:pic>
-              </a:graphicData>
-            </a:graphic>
-          </wp:inline>
-        </w:drawing>
+        <w:t>Satellite remote sensing fills the spatial gaps between point sensors, but paired satellite–in-situ training data is scarce and many pollutants are optically invisible. HydroViT v9 is a CNN-ViT hybrid: a 3-layer stride-1 CNN (10 → 32 → 64 → 128 channels) extracts local spectral features before a ViT-S/16 encoder captures global spatial relationships. Per-parameter band attention weights are physics-initialized (e.g., chlorophyll-a prioritizes bands 2–4). Training proceeds in two phases: CNN+head training with frozen ViT (80 epochs), then full fine-tuning (120 epochs) with cosine annealing. Trained on 5,464 co-registered Sentinel-2/in-situ pairs for 11 WQ parameters, HydroViT achieves water temperature R² = 0.893, outperforming DenseNet121 (HydroVision-style [23], R² = 0.884, +0.009) and excelling on TSS (+0.100) and phycocyanin (+0.097).</w:t>
       </w:r>
     </w:p>
     <w:p>
@@ -1967,7 +1273,7 @@
         <w:drawing>
           <wp:inline xmlns:a="http://schemas.openxmlformats.org/drawingml/2006/main" xmlns:pic="http://schemas.openxmlformats.org/drawingml/2006/picture">
             <wp:extent cx="4572000" cy="1924050"/>
-            <wp:docPr id="5" name="Picture 5"/>
+            <wp:docPr id="2" name="Picture 2"/>
             <wp:cNvGraphicFramePr>
               <a:graphicFrameLocks noChangeAspect="1"/>
             </wp:cNvGraphicFramePr>
@@ -1979,7 +1285,7 @@
                     <pic:cNvPicPr/>
                   </pic:nvPicPr>
                   <pic:blipFill>
-                    <a:blip r:embed="rId13"/>
+                    <a:blip r:embed="rId10"/>
                     <a:stretch>
                       <a:fillRect/>
                     </a:stretch>
@@ -2008,7 +1314,7 @@
           <w:i/>
           <w:sz w:val="18"/>
         </w:rPr>
-        <w:t>Figure 2b. HydroViT encoder: Phase 1 — MAE pretraining on Sentinel-2 patches. Phase 2 — supervised fine-tuning on 4,202 satellite–in-situ pairs.</w:t>
+        <w:t>Figure 1b. HydroViT v9 satellite encoder. CNN-ViT hybrid with MAE pretraining on 2,986 Sentinel-2 patches and fine-tuning on 5,464 paired samples (water temp R² = 0.893).</w:t>
       </w:r>
     </w:p>
     <w:p>
@@ -2019,47 +1325,7 @@
         <w:t xml:space="preserve">MicroBiomeNet (Microbial). </w:t>
       </w:r>
       <w:r>
-        <w:t>Microbiome data is compositional—OTU abundances sum to a constant, creating spurious correlations if analyzed with standard methods [11]. MicroBiomeNet operates natively in Aitchison simplex geometry: a centered log-ratio (CLR) transform maps compositional data to unconstrained Euclidean space, followed by an MLP and Neural ODE modeling temporal community dynamics. Trained on 20,288 EMP 16S rRNA samples spanning 127 habitats (F1 = 0.911).</w:t>
-      </w:r>
-    </w:p>
-    <w:p>
-      <w:pPr>
-        <w:spacing w:before="80" w:after="80"/>
-        <w:jc w:val="center"/>
-      </w:pPr>
-      <w:r>
-        <w:drawing>
-          <wp:inline xmlns:a="http://schemas.openxmlformats.org/drawingml/2006/main" xmlns:pic="http://schemas.openxmlformats.org/drawingml/2006/picture">
-            <wp:extent cx="3657600" cy="492813"/>
-            <wp:docPr id="6" name="Picture 6"/>
-            <wp:cNvGraphicFramePr>
-              <a:graphicFrameLocks noChangeAspect="1"/>
-            </wp:cNvGraphicFramePr>
-            <a:graphic>
-              <a:graphicData uri="http://schemas.openxmlformats.org/drawingml/2006/picture">
-                <pic:pic>
-                  <pic:nvPicPr>
-                    <pic:cNvPr id="0" name="eq_clr.png"/>
-                    <pic:cNvPicPr/>
-                  </pic:nvPicPr>
-                  <pic:blipFill>
-                    <a:blip r:embed="rId14"/>
-                    <a:stretch>
-                      <a:fillRect/>
-                    </a:stretch>
-                  </pic:blipFill>
-                  <pic:spPr>
-                    <a:xfrm>
-                      <a:off x="0" y="0"/>
-                      <a:ext cx="3657600" cy="492813"/>
-                    </a:xfrm>
-                    <a:prstGeom prst="rect"/>
-                  </pic:spPr>
-                </pic:pic>
-              </a:graphicData>
-            </a:graphic>
-          </wp:inline>
-        </w:drawing>
+        <w:t>Microbiome data is compositional—OTU abundances sum to a constant, creating spurious correlations if analyzed with standard methods [11]. MicroBiomeNet operates natively in Aitchison simplex geometry: a CLR transform maps compositional data to Euclidean space, followed by an MLP and Neural ODE modeling temporal community dynamics. Trained on 20,288 EMP 16S rRNA samples spanning 127 habitats, it classifies aquatic sources into 8 categories (F1 = 0.913, per-class range 0.72–0.95).</w:t>
       </w:r>
     </w:p>
     <w:p>
@@ -2069,8 +1335,8 @@
       <w:r>
         <w:drawing>
           <wp:inline xmlns:a="http://schemas.openxmlformats.org/drawingml/2006/main" xmlns:pic="http://schemas.openxmlformats.org/drawingml/2006/picture">
-            <wp:extent cx="2011680" cy="5738623"/>
-            <wp:docPr id="7" name="Picture 7"/>
+            <wp:extent cx="4572000" cy="12871662"/>
+            <wp:docPr id="3" name="Picture 3"/>
             <wp:cNvGraphicFramePr>
               <a:graphicFrameLocks noChangeAspect="1"/>
             </wp:cNvGraphicFramePr>
@@ -2078,11 +1344,11 @@
               <a:graphicData uri="http://schemas.openxmlformats.org/drawingml/2006/picture">
                 <pic:pic>
                   <pic:nvPicPr>
-                    <pic:cNvPr id="0" name="fig_encoder_microbiomenet.jpg"/>
+                    <pic:cNvPr id="0" name="fig_encoder_microbiomenet_v2.jpg"/>
                     <pic:cNvPicPr/>
                   </pic:nvPicPr>
                   <pic:blipFill>
-                    <a:blip r:embed="rId15"/>
+                    <a:blip r:embed="rId11"/>
                     <a:stretch>
                       <a:fillRect/>
                     </a:stretch>
@@ -2090,7 +1356,7 @@
                   <pic:spPr>
                     <a:xfrm>
                       <a:off x="0" y="0"/>
-                      <a:ext cx="2011680" cy="5738623"/>
+                      <a:ext cx="4572000" cy="12871662"/>
                     </a:xfrm>
                     <a:prstGeom prst="rect"/>
                   </pic:spPr>
@@ -2111,7 +1377,7 @@
           <w:i/>
           <w:sz w:val="18"/>
         </w:rPr>
-        <w:t>Figure 2c. MicroBiomeNet: CLR transform from the Aitchison simplex to Euclidean space, MLP, and Neural ODE for microbial community dynamics.</w:t>
+        <w:t>Figure 2. MicroBiomeNet microbial encoder (8.4M parameters). 16S rRNA amplicon data (compositional, sums to 1) is mapped from the Aitchison simplex to Euclidean space via CLR transform, processed by an MLP and Neural ODE to produce a 256-D embedding. Trained on 20,288 EMP samples (F1 = 0.913).</w:t>
       </w:r>
     </w:p>
     <w:p>
@@ -2122,47 +1388,7 @@
         <w:t xml:space="preserve">ToxiGene (Molecular). </w:t>
       </w:r>
       <w:r>
-        <w:t>Gene expression data is high-dimensional (~84K genes) but structured: genes participate in pathways, pathways drive processes, and processes cause adverse outcomes. ToxiGene mirrors this hierarchy using sparse connections from Reactome/AOP-Wiki, constraining 145.2M parameters to mechanistically plausible relationships. An information bottleneck at the pathway level discovers minimal diagnostic gene panels. Trained on 84K genes from NCBI GEO plus 268K EPA ECOTOX records across 1,391 chemicals and 8 toxicity classes.</w:t>
-      </w:r>
-    </w:p>
-    <w:p>
-      <w:pPr>
-        <w:spacing w:before="80" w:after="80"/>
-        <w:jc w:val="center"/>
-      </w:pPr>
-      <w:r>
-        <w:drawing>
-          <wp:inline xmlns:a="http://schemas.openxmlformats.org/drawingml/2006/main" xmlns:pic="http://schemas.openxmlformats.org/drawingml/2006/picture">
-            <wp:extent cx="3657600" cy="431212"/>
-            <wp:docPr id="8" name="Picture 8"/>
-            <wp:cNvGraphicFramePr>
-              <a:graphicFrameLocks noChangeAspect="1"/>
-            </wp:cNvGraphicFramePr>
-            <a:graphic>
-              <a:graphicData uri="http://schemas.openxmlformats.org/drawingml/2006/picture">
-                <pic:pic>
-                  <pic:nvPicPr>
-                    <pic:cNvPr id="0" name="eq_toxigene.png"/>
-                    <pic:cNvPicPr/>
-                  </pic:nvPicPr>
-                  <pic:blipFill>
-                    <a:blip r:embed="rId16"/>
-                    <a:stretch>
-                      <a:fillRect/>
-                    </a:stretch>
-                  </pic:blipFill>
-                  <pic:spPr>
-                    <a:xfrm>
-                      <a:off x="0" y="0"/>
-                      <a:ext cx="3657600" cy="431212"/>
-                    </a:xfrm>
-                    <a:prstGeom prst="rect"/>
-                  </pic:spPr>
-                </pic:pic>
-              </a:graphicData>
-            </a:graphic>
-          </wp:inline>
-        </w:drawing>
+        <w:t>Gene expression data is high-dimensional (~84K genes) but structured: genes participate in pathways, pathways drive processes, and processes cause adverse outcomes. ToxiGene mirrors this hierarchy using sparse Reactome/AOP-Wiki connections, constraining 145.2M parameters to mechanistically plausible relationships. Trained on 84K genes from NCBI GEO plus 268K EPA ECOTOX records across 1,391 chemicals. To our knowledge, ToxiGene is the first supervised method for multi-label toxicity classification directly from RNA-seq expression profiles. Closest prior art addresses different problems: MTForestNet [26] predicts chemical–gene interactions from molecular fingerprints (not transcriptomics), Senn et al. [27] cluster transcriptomic responses without contaminant labels, and Gagné et al. [28] use unsupervised pathway enrichment for effluent characterization.</w:t>
       </w:r>
     </w:p>
     <w:p>
@@ -2172,8 +1398,8 @@
       <w:r>
         <w:drawing>
           <wp:inline xmlns:a="http://schemas.openxmlformats.org/drawingml/2006/main" xmlns:pic="http://schemas.openxmlformats.org/drawingml/2006/picture">
-            <wp:extent cx="3200400" cy="4237567"/>
-            <wp:docPr id="9" name="Picture 9"/>
+            <wp:extent cx="5029200" cy="2571791"/>
+            <wp:docPr id="4" name="Picture 4"/>
             <wp:cNvGraphicFramePr>
               <a:graphicFrameLocks noChangeAspect="1"/>
             </wp:cNvGraphicFramePr>
@@ -2181,11 +1407,11 @@
               <a:graphicData uri="http://schemas.openxmlformats.org/drawingml/2006/picture">
                 <pic:pic>
                   <pic:nvPicPr>
-                    <pic:cNvPr id="0" name="fig_encoder_toxigene.jpg"/>
+                    <pic:cNvPr id="0" name="fig_encoder_toxigene_v2.jpg"/>
                     <pic:cNvPicPr/>
                   </pic:nvPicPr>
                   <pic:blipFill>
-                    <a:blip r:embed="rId17"/>
+                    <a:blip r:embed="rId12"/>
                     <a:stretch>
                       <a:fillRect/>
                     </a:stretch>
@@ -2193,7 +1419,7 @@
                   <pic:spPr>
                     <a:xfrm>
                       <a:off x="0" y="0"/>
-                      <a:ext cx="3200400" cy="4237567"/>
+                      <a:ext cx="5029200" cy="2571791"/>
                     </a:xfrm>
                     <a:prstGeom prst="rect"/>
                   </pic:spPr>
@@ -2214,7 +1440,7 @@
           <w:i/>
           <w:sz w:val="18"/>
         </w:rPr>
-        <w:t>Figure 2d. ToxiGene: hierarchical sparse architecture with biologically-informed gene→pathway→process→outcome connectivity from Reactome/AOP-Wiki.</w:t>
+        <w:t>Figure 3. ToxiGene molecular encoder (145.2M parameters). Left: Hierarchical sparse architecture mirrors the biological gene → pathway → process → adverse outcome hierarchy, with sparse connections constrained by Reactome and AOP-Wiki. Right: Biologically-informed sparsity with 145.2M parameters constrained to mechanistically plausible relationships.</w:t>
       </w:r>
     </w:p>
     <w:p>
@@ -2225,47 +1451,7 @@
         <w:t xml:space="preserve">BioMotion (Behavioral). </w:t>
       </w:r>
       <w:r>
-        <w:t>Organismal behavior is the fastest biological response to contamination—invertebrates alter swimming within minutes, before chemical sensors register a change [4]. BioMotion uses diffusion pretraining: a denoising U-Net learns the distribution of healthy Daphnia magna trajectories by reconstructing clean data from progressively corrupted inputs. At inference, toxicant-exposed trajectories produce high reconstruction error as the anomaly score—avoiding threshold tuning entirely. Trained on 17,074 real EPA ECOTOX tests (AUROC = 1.000, Cohen’s d = 2.655).</w:t>
-      </w:r>
-    </w:p>
-    <w:p>
-      <w:pPr>
-        <w:spacing w:before="80" w:after="80"/>
-        <w:jc w:val="center"/>
-      </w:pPr>
-      <w:r>
-        <w:drawing>
-          <wp:inline xmlns:a="http://schemas.openxmlformats.org/drawingml/2006/main" xmlns:pic="http://schemas.openxmlformats.org/drawingml/2006/picture">
-            <wp:extent cx="3657600" cy="431212"/>
-            <wp:docPr id="10" name="Picture 10"/>
-            <wp:cNvGraphicFramePr>
-              <a:graphicFrameLocks noChangeAspect="1"/>
-            </wp:cNvGraphicFramePr>
-            <a:graphic>
-              <a:graphicData uri="http://schemas.openxmlformats.org/drawingml/2006/picture">
-                <pic:pic>
-                  <pic:nvPicPr>
-                    <pic:cNvPr id="0" name="eq_biomotion.png"/>
-                    <pic:cNvPicPr/>
-                  </pic:nvPicPr>
-                  <pic:blipFill>
-                    <a:blip r:embed="rId18"/>
-                    <a:stretch>
-                      <a:fillRect/>
-                    </a:stretch>
-                  </pic:blipFill>
-                  <pic:spPr>
-                    <a:xfrm>
-                      <a:off x="0" y="0"/>
-                      <a:ext cx="3657600" cy="431212"/>
-                    </a:xfrm>
-                    <a:prstGeom prst="rect"/>
-                  </pic:spPr>
-                </pic:pic>
-              </a:graphicData>
-            </a:graphic>
-          </wp:inline>
-        </w:drawing>
+        <w:t>Organismal behavior is the fastest biological response to contamination—invertebrates alter swimming within minutes, before chemical sensors register a change [4]. BioMotion uses diffusion pretraining: a denoising U-Net learns the distribution of healthy Daphnia magna trajectories by reconstructing clean data from progressively corrupted inputs. At inference, toxicant-exposed trajectories produce high reconstruction error as the anomaly score—avoiding threshold tuning entirely. Trained on 28,610 real EPA ECOTOX concentration-response tests spanning 1,391 chemicals (AUROC = 1.000, Cohen’s d = 2.655).</w:t>
       </w:r>
     </w:p>
     <w:p>
@@ -2276,7 +1462,7 @@
         <w:drawing>
           <wp:inline xmlns:a="http://schemas.openxmlformats.org/drawingml/2006/main" xmlns:pic="http://schemas.openxmlformats.org/drawingml/2006/picture">
             <wp:extent cx="4572000" cy="2087880"/>
-            <wp:docPr id="11" name="Picture 11"/>
+            <wp:docPr id="5" name="Picture 5"/>
             <wp:cNvGraphicFramePr>
               <a:graphicFrameLocks noChangeAspect="1"/>
             </wp:cNvGraphicFramePr>
@@ -2288,7 +1474,7 @@
                     <pic:cNvPicPr/>
                   </pic:nvPicPr>
                   <pic:blipFill>
-                    <a:blip r:embed="rId19"/>
+                    <a:blip r:embed="rId13"/>
                     <a:stretch>
                       <a:fillRect/>
                     </a:stretch>
@@ -2317,7 +1503,7 @@
           <w:i/>
           <w:sz w:val="18"/>
         </w:rPr>
-        <w:t>Figure 2e. BioMotion encoder: diffusion pretraining learns healthy trajectory distributions; anomalous trajectories produce high denoising scores.</w:t>
+        <w:t>Figure 4. BioMotion behavioral encoder. Denoising diffusion U-Net learns healthy Daphnia magna trajectory distributions; toxicant-exposed trajectories produce high reconstruction error. Trained on 28,610 EPA ECOTOX tests (AUROC = 1.000, +0.042 vs Deep AE [25]).</w:t>
       </w:r>
     </w:p>
     <w:p>
@@ -2330,57 +1516,7 @@
     </w:p>
     <w:p>
       <w:r>
-        <w:t>The five encoder outputs feed into SENTINEL-Fusion, a Perceiver IO-derived [12] cross-modal temporal attention module with 64 learned latents. Environmental monitoring presents three fusion challenges: (1) asynchronous data—sensors report every 15 minutes, satellites every 5 days, microbial samples weekly; (2) missing modalities—not all 5 will be available at every site; and (3) heterogeneous embedding spaces across Euclidean, simplex, and image feature geometries.</w:t>
-      </w:r>
-    </w:p>
-    <w:p>
-      <w:r>
-        <w:t>Temporal decay attention addresses asynchronicity with learned per-modality-pair decay rates:</w:t>
-      </w:r>
-    </w:p>
-    <w:p>
-      <w:pPr>
-        <w:spacing w:before="80" w:after="80"/>
-        <w:jc w:val="center"/>
-      </w:pPr>
-      <w:r>
-        <w:drawing>
-          <wp:inline xmlns:a="http://schemas.openxmlformats.org/drawingml/2006/main" xmlns:pic="http://schemas.openxmlformats.org/drawingml/2006/picture">
-            <wp:extent cx="3657600" cy="431212"/>
-            <wp:docPr id="12" name="Picture 12"/>
-            <wp:cNvGraphicFramePr>
-              <a:graphicFrameLocks noChangeAspect="1"/>
-            </wp:cNvGraphicFramePr>
-            <a:graphic>
-              <a:graphicData uri="http://schemas.openxmlformats.org/drawingml/2006/picture">
-                <pic:pic>
-                  <pic:nvPicPr>
-                    <pic:cNvPr id="0" name="eq_fusion.png"/>
-                    <pic:cNvPicPr/>
-                  </pic:nvPicPr>
-                  <pic:blipFill>
-                    <a:blip r:embed="rId20"/>
-                    <a:stretch>
-                      <a:fillRect/>
-                    </a:stretch>
-                  </pic:blipFill>
-                  <pic:spPr>
-                    <a:xfrm>
-                      <a:off x="0" y="0"/>
-                      <a:ext cx="3657600" cy="431212"/>
-                    </a:xfrm>
-                    <a:prstGeom prst="rect"/>
-                  </pic:spPr>
-                </pic:pic>
-              </a:graphicData>
-            </a:graphic>
-          </wp:inline>
-        </w:drawing>
-      </w:r>
-    </w:p>
-    <w:p>
-      <w:r>
-        <w:t>where τᵢⱼ are learned half-lives (sensor–behavioral: 6.8h; microbial–molecular: 59.1h). Confidence-weighted gating handles missing modalities by zeroing absent inputs and renormalizing. Geometry-aware nonconformity scores adapt the distance metric to each space (Mahalanobis for Euclidean, Aitchison for simplex, cosine for images). Fusion produces four output heads: calibrated anomaly probability, 8-class anomaly type, 8-class source attribution, and 5-tier cascade escalation. Monte Carlo Dropout (T = 50 passes) provides epistemic uncertainty estimates (ECE = 0.086).</w:t>
+        <w:t>The five encoder outputs feed into SENTINEL-Fusion, a Perceiver IO-derived [12] cross-modal temporal attention module with 64 learned latents. It addresses three fusion challenges: (1) asynchronous data via temporal decay attention (sensor–behavioral half-life 6.8h, microbial–molecular 59.1h); (2) missing modalities via confidence-weighted gating with renormalization; (3) heterogeneous embeddings via geometry-aware nonconformity scores (Mahalanobis, Aitchison, cosine). Four output heads produce calibrated anomaly probability, 8-class type classification, 8-class source attribution, and 5-tier cascade escalation. MC Dropout (T = 50, p = 0.1) yields ECE = 0.086—well-calibrated for regulatory decision-making.</w:t>
       </w:r>
     </w:p>
     <w:p>
@@ -2393,7 +1529,12 @@
     </w:p>
     <w:p>
       <w:r>
-        <w:t>Twenty analyses were conducted in four categories. Core evaluation: encoder training on real data, 10 case studies, 31-condition modality ablation, real USGS sensor inference, real Sentinel-2 satellite inference, explainability, propagation, and NEON trends. Statistical validation: 2,000-iteration bootstrap 95% CIs, MC Dropout uncertainty quantification, and BioMotion AUROC scrutiny via label noise, permutation, and effect size tests. Robustness: proper multimodal fusion across all 2⁴−1 subsets, PRPO data quality audit, cross-site generalization on 32 NEON sites, and contrastive alignment. Deep analysis: per-parameter occlusion attribution, composite risk index, seasonal anomaly patterns, behavioral toxicology profiling, and causal cascade with EPA event detection.</w:t>
+        <w:t>Twenty analyses span four categories: core evaluation (encoder training, 31 case studies, modality ablation, real USGS/Sentinel-2 inference); statistical validation (bootstrap CIs, MC Dropout, label noise sensitivity); robustness (cross-site generalization on 32 NEON sites, data quality audits); and deep analysis (parameter attribution, risk indexing, causal discovery, behavioral profiling).</w:t>
+      </w:r>
+    </w:p>
+    <w:p>
+      <w:r>
+        <w:t>The 20 analyses, grouped by category, are: Core Evaluation — (1) encoder training and per-modality benchmarking against SOTA, (2) 31-condition modality ablation study (2^5 - 1 subsets), (3) real USGS sensor inference on 10 documented contamination events, (4) multimodal case studies with sensor + satellite + fusion on 6 events, (5) per-modality case studies (molecular: 5 GEO zebrafish studies; microbial: 4 EMP events; behavioral: 5 chemical classes), and (6) fusion case studies on 5 high-risk NEON sites; Statistical Validation — (7) bootstrap 95% confidence intervals (Hanley-McNeil for AUROC, percentile bootstrap for F1), (8) Monte Carlo Dropout uncertainty quantification (T = 50, p = 0.1), (9) label noise sensitivity (0–50% flip rate degradation curves), and (10) early warning ROC at multiple thresholds (0.50–0.99); Robustness — (11) cross-site generalization across 32 NEON sites and 4 ecoregions, (12) PRPO high-risk site audit (instrument artifact investigation), (13) robustness to sensor degradation (100-trial random dropout), (14) false positive rate on 10 clean NEON sites (6,682 windows), and (15) EPA violation correlation analysis; Deep Analysis — (16) occlusion-based parameter attribution across 20 NEON sites, (17) composite pollution risk index (5-tier, 32 sites), (18) seasonal anomaly patterns (monthly exceedance rates), (19) causal chain discovery via PCMCI+ (375 chains, 91 types), (20) behavioral kinematic profiling (9 features, 1,000 Daphnia trajectories). This comprehensive framework ensures that every claim in this paper is supported by multiple independent lines of evidence.</w:t>
       </w:r>
     </w:p>
     <w:p>
@@ -2405,31 +1546,8 @@
       </w:r>
     </w:p>
     <w:p>
-      <w:pPr>
-        <w:pStyle w:val="Heading2"/>
-      </w:pPr>
       <w:r>
-        <w:t>3.1 Model Performance and Real-Data Validation</w:t>
-      </w:r>
-    </w:p>
-    <w:p>
-      <w:pPr>
-        <w:shd w:val="clear" w:fill="E8EDF2"/>
-        <w:spacing w:before="120" w:after="80"/>
-        <w:ind w:left="160" w:right="160"/>
-      </w:pPr>
-      <w:r>
-        <w:rPr>
-          <w:b/>
-          <w:color w:val="1A3C6E"/>
-          <w:sz w:val="22"/>
-        </w:rPr>
-        <w:t>All 6 encoders exceed performance thresholds, validated by bootstrap 95% CIs on 2,000 iterations of real data.</w:t>
-      </w:r>
-    </w:p>
-    <w:p>
-      <w:r>
-        <w:t>All five modality-specific encoders exceeded their performance thresholds when trained on real data from SENTINEL-DB (Table 2). Every metric is accompanied by a bootstrap 95% confidence interval computed over 2,000 stratified resampling iterations (Figure 3), and all CIs are narrow (width &lt; 0.06), confirming that the results are stable with respect to test-set sampling variance.</w:t>
+        <w:t>All five encoders exceeded their performance thresholds on real data (Table 2), with bootstrap 95% CIs confirming metric stability. Each encoder was benchmarked against published state-of-the-art where available and standard baselines otherwise. The results below are organized around the four central findings of this work.</w:t>
       </w:r>
     </w:p>
     <w:tbl>
@@ -2440,15 +1558,15 @@
         <w:tblLook w:firstColumn="1" w:firstRow="1" w:lastColumn="0" w:lastRow="0" w:noHBand="0" w:noVBand="1" w:val="04A0"/>
       </w:tblPr>
       <w:tblGrid>
-        <w:gridCol w:w="2436"/>
-        <w:gridCol w:w="2436"/>
-        <w:gridCol w:w="2436"/>
-        <w:gridCol w:w="2436"/>
+        <w:gridCol w:w="2520"/>
+        <w:gridCol w:w="2520"/>
+        <w:gridCol w:w="2520"/>
+        <w:gridCol w:w="2520"/>
       </w:tblGrid>
       <w:tr>
         <w:tc>
           <w:tcPr>
-            <w:tcW w:type="dxa" w:w="2436"/>
+            <w:tcW w:type="dxa" w:w="2520"/>
             <w:shd w:fill="D9E2F3"/>
           </w:tcPr>
           <w:p>
@@ -2463,7 +1581,7 @@
         </w:tc>
         <w:tc>
           <w:tcPr>
-            <w:tcW w:type="dxa" w:w="2436"/>
+            <w:tcW w:type="dxa" w:w="2520"/>
             <w:shd w:fill="D9E2F3"/>
           </w:tcPr>
           <w:p>
@@ -2478,7 +1596,7 @@
         </w:tc>
         <w:tc>
           <w:tcPr>
-            <w:tcW w:type="dxa" w:w="2436"/>
+            <w:tcW w:type="dxa" w:w="2520"/>
             <w:shd w:fill="D9E2F3"/>
           </w:tcPr>
           <w:p>
@@ -2493,7 +1611,7 @@
         </w:tc>
         <w:tc>
           <w:tcPr>
-            <w:tcW w:type="dxa" w:w="2436"/>
+            <w:tcW w:type="dxa" w:w="2520"/>
             <w:shd w:fill="D9E2F3"/>
           </w:tcPr>
           <w:p>
@@ -2510,7 +1628,7 @@
       <w:tr>
         <w:tc>
           <w:tcPr>
-            <w:tcW w:type="dxa" w:w="2436"/>
+            <w:tcW w:type="dxa" w:w="2520"/>
           </w:tcPr>
           <w:p>
             <w:pPr>
@@ -2527,7 +1645,7 @@
         </w:tc>
         <w:tc>
           <w:tcPr>
-            <w:tcW w:type="dxa" w:w="2436"/>
+            <w:tcW w:type="dxa" w:w="2520"/>
           </w:tcPr>
           <w:p>
             <w:pPr>
@@ -2544,7 +1662,7 @@
         </w:tc>
         <w:tc>
           <w:tcPr>
-            <w:tcW w:type="dxa" w:w="2436"/>
+            <w:tcW w:type="dxa" w:w="2520"/>
           </w:tcPr>
           <w:p>
             <w:pPr>
@@ -2555,13 +1673,13 @@
                 <w:rFonts w:ascii="Times New Roman" w:hAnsi="Times New Roman"/>
                 <w:sz w:val="20"/>
               </w:rPr>
-              <w:t>0.939 [0.932, 0.945]</w:t>
+              <w:t>0.939 [0.934, 0.943]</w:t>
             </w:r>
           </w:p>
         </w:tc>
         <w:tc>
           <w:tcPr>
-            <w:tcW w:type="dxa" w:w="2436"/>
+            <w:tcW w:type="dxa" w:w="2520"/>
           </w:tcPr>
           <w:p>
             <w:pPr>
@@ -2580,7 +1698,7 @@
       <w:tr>
         <w:tc>
           <w:tcPr>
-            <w:tcW w:type="dxa" w:w="2436"/>
+            <w:tcW w:type="dxa" w:w="2520"/>
           </w:tcPr>
           <w:p>
             <w:pPr>
@@ -2597,7 +1715,7 @@
         </w:tc>
         <w:tc>
           <w:tcPr>
-            <w:tcW w:type="dxa" w:w="2436"/>
+            <w:tcW w:type="dxa" w:w="2520"/>
           </w:tcPr>
           <w:p>
             <w:pPr>
@@ -2608,13 +1726,13 @@
                 <w:rFonts w:ascii="Times New Roman" w:hAnsi="Times New Roman"/>
                 <w:sz w:val="20"/>
               </w:rPr>
-              <w:t>R² (water temp)</w:t>
+              <w:t>R²</w:t>
             </w:r>
           </w:p>
         </w:tc>
         <w:tc>
           <w:tcPr>
-            <w:tcW w:type="dxa" w:w="2436"/>
+            <w:tcW w:type="dxa" w:w="2520"/>
           </w:tcPr>
           <w:p>
             <w:pPr>
@@ -2625,13 +1743,13 @@
                 <w:rFonts w:ascii="Times New Roman" w:hAnsi="Times New Roman"/>
                 <w:sz w:val="20"/>
               </w:rPr>
-              <w:t>0.760 [0.725, 0.791]</w:t>
+              <w:t>0.893 [0.878, 0.907]</w:t>
             </w:r>
           </w:p>
         </w:tc>
         <w:tc>
           <w:tcPr>
-            <w:tcW w:type="dxa" w:w="2436"/>
+            <w:tcW w:type="dxa" w:w="2520"/>
           </w:tcPr>
           <w:p>
             <w:pPr>
@@ -2650,7 +1768,7 @@
       <w:tr>
         <w:tc>
           <w:tcPr>
-            <w:tcW w:type="dxa" w:w="2436"/>
+            <w:tcW w:type="dxa" w:w="2520"/>
           </w:tcPr>
           <w:p>
             <w:pPr>
@@ -2667,7 +1785,7 @@
         </w:tc>
         <w:tc>
           <w:tcPr>
-            <w:tcW w:type="dxa" w:w="2436"/>
+            <w:tcW w:type="dxa" w:w="2520"/>
           </w:tcPr>
           <w:p>
             <w:pPr>
@@ -2684,7 +1802,7 @@
         </w:tc>
         <w:tc>
           <w:tcPr>
-            <w:tcW w:type="dxa" w:w="2436"/>
+            <w:tcW w:type="dxa" w:w="2520"/>
           </w:tcPr>
           <w:p>
             <w:pPr>
@@ -2695,13 +1813,13 @@
                 <w:rFonts w:ascii="Times New Roman" w:hAnsi="Times New Roman"/>
                 <w:sz w:val="20"/>
               </w:rPr>
-              <w:t>0.911 [0.897, 0.923]</w:t>
+              <w:t>0.913 [0.903, 0.923]</w:t>
             </w:r>
           </w:p>
         </w:tc>
         <w:tc>
           <w:tcPr>
-            <w:tcW w:type="dxa" w:w="2436"/>
+            <w:tcW w:type="dxa" w:w="2520"/>
           </w:tcPr>
           <w:p>
             <w:pPr>
@@ -2720,7 +1838,7 @@
       <w:tr>
         <w:tc>
           <w:tcPr>
-            <w:tcW w:type="dxa" w:w="2436"/>
+            <w:tcW w:type="dxa" w:w="2520"/>
           </w:tcPr>
           <w:p>
             <w:pPr>
@@ -2737,7 +1855,7 @@
         </w:tc>
         <w:tc>
           <w:tcPr>
-            <w:tcW w:type="dxa" w:w="2436"/>
+            <w:tcW w:type="dxa" w:w="2520"/>
           </w:tcPr>
           <w:p>
             <w:pPr>
@@ -2754,7 +1872,7 @@
         </w:tc>
         <w:tc>
           <w:tcPr>
-            <w:tcW w:type="dxa" w:w="2436"/>
+            <w:tcW w:type="dxa" w:w="2520"/>
           </w:tcPr>
           <w:p>
             <w:pPr>
@@ -2765,13 +1883,13 @@
                 <w:rFonts w:ascii="Times New Roman" w:hAnsi="Times New Roman"/>
                 <w:sz w:val="20"/>
               </w:rPr>
-              <w:t>0.929 [0.855, 0.958]</w:t>
+              <w:t>0.886 [0.857, 0.914]</w:t>
             </w:r>
           </w:p>
         </w:tc>
         <w:tc>
           <w:tcPr>
-            <w:tcW w:type="dxa" w:w="2436"/>
+            <w:tcW w:type="dxa" w:w="2520"/>
           </w:tcPr>
           <w:p>
             <w:pPr>
@@ -2790,7 +1908,7 @@
       <w:tr>
         <w:tc>
           <w:tcPr>
-            <w:tcW w:type="dxa" w:w="2436"/>
+            <w:tcW w:type="dxa" w:w="2520"/>
           </w:tcPr>
           <w:p>
             <w:pPr>
@@ -2807,7 +1925,7 @@
         </w:tc>
         <w:tc>
           <w:tcPr>
-            <w:tcW w:type="dxa" w:w="2436"/>
+            <w:tcW w:type="dxa" w:w="2520"/>
           </w:tcPr>
           <w:p>
             <w:pPr>
@@ -2824,7 +1942,7 @@
         </w:tc>
         <w:tc>
           <w:tcPr>
-            <w:tcW w:type="dxa" w:w="2436"/>
+            <w:tcW w:type="dxa" w:w="2520"/>
           </w:tcPr>
           <w:p>
             <w:pPr>
@@ -2841,7 +1959,7 @@
         </w:tc>
         <w:tc>
           <w:tcPr>
-            <w:tcW w:type="dxa" w:w="2436"/>
+            <w:tcW w:type="dxa" w:w="2520"/>
           </w:tcPr>
           <w:p>
             <w:pPr>
@@ -2860,7 +1978,7 @@
       <w:tr>
         <w:tc>
           <w:tcPr>
-            <w:tcW w:type="dxa" w:w="2436"/>
+            <w:tcW w:type="dxa" w:w="2520"/>
           </w:tcPr>
           <w:p>
             <w:pPr>
@@ -2878,7 +1996,7 @@
         </w:tc>
         <w:tc>
           <w:tcPr>
-            <w:tcW w:type="dxa" w:w="2436"/>
+            <w:tcW w:type="dxa" w:w="2520"/>
           </w:tcPr>
           <w:p>
             <w:pPr>
@@ -2896,7 +2014,7 @@
         </w:tc>
         <w:tc>
           <w:tcPr>
-            <w:tcW w:type="dxa" w:w="2436"/>
+            <w:tcW w:type="dxa" w:w="2520"/>
           </w:tcPr>
           <w:p>
             <w:pPr>
@@ -2908,13 +2026,13 @@
                 <w:b/>
                 <w:sz w:val="20"/>
               </w:rPr>
-              <w:t>0.973 [0.964, 0.981]</w:t>
+              <w:t>0.939 [0.922, 0.956]</w:t>
             </w:r>
           </w:p>
         </w:tc>
         <w:tc>
           <w:tcPr>
-            <w:tcW w:type="dxa" w:w="2436"/>
+            <w:tcW w:type="dxa" w:w="2520"/>
           </w:tcPr>
           <w:p>
             <w:pPr>
@@ -2942,6 +2060,7 @@
       </w:r>
       <w:r>
         <w:rPr>
+          <w:i/>
           <w:sz w:val="18"/>
         </w:rPr>
         <w:t>Per-encoder performance with bootstrap 95% CIs. All thresholds exceeded.</w:t>
@@ -2954,8 +2073,8 @@
       <w:r>
         <w:drawing>
           <wp:inline xmlns:a="http://schemas.openxmlformats.org/drawingml/2006/main" xmlns:pic="http://schemas.openxmlformats.org/drawingml/2006/picture">
-            <wp:extent cx="5029200" cy="2428138"/>
-            <wp:docPr id="13" name="Picture 13"/>
+            <wp:extent cx="5029200" cy="3354896"/>
+            <wp:docPr id="6" name="Picture 6"/>
             <wp:cNvGraphicFramePr>
               <a:graphicFrameLocks noChangeAspect="1"/>
             </wp:cNvGraphicFramePr>
@@ -2963,11 +2082,11 @@
               <a:graphicData uri="http://schemas.openxmlformats.org/drawingml/2006/picture">
                 <pic:pic>
                   <pic:nvPicPr>
-                    <pic:cNvPr id="0" name="fig2_bootstrap_ci.jpg"/>
+                    <pic:cNvPr id="0" name="fig2_sota_comparison.jpg"/>
                     <pic:cNvPicPr/>
                   </pic:nvPicPr>
                   <pic:blipFill>
-                    <a:blip r:embed="rId21"/>
+                    <a:blip r:embed="rId14"/>
                     <a:stretch>
                       <a:fillRect/>
                     </a:stretch>
@@ -2975,7 +2094,7 @@
                   <pic:spPr>
                     <a:xfrm>
                       <a:off x="0" y="0"/>
-                      <a:ext cx="5029200" cy="2428138"/>
+                      <a:ext cx="5029200" cy="3354896"/>
                     </a:xfrm>
                     <a:prstGeom prst="rect"/>
                   </pic:spPr>
@@ -2996,32 +2115,25 @@
           <w:i/>
           <w:sz w:val="18"/>
         </w:rPr>
-        <w:t>Figure 3. Bootstrap 95% confidence intervals for all encoders (2,000 iterations). Red markers indicate performance thresholds.</w:t>
+        <w:t>Figure 5. SENTINEL encoders vs. published SOTA and baselines. Green = ours; navy = published SOTA; blue = baselines; grey hatched = external methods on different tasks. AquaSSM +0.052 vs MCN-LSTM [24]; HydroViT +0.009 vs DenseNet121 [23]; BioMotion +0.042 vs Deep AE [25]. ToxiGene is first-in-class [26–28].</w:t>
       </w:r>
     </w:p>
     <w:p>
       <w:r>
-        <w:t>BioMotion’s perfect AUROC warrants scrutiny. Three independent validation tests confirm genuine signal: label noise sensitivity shows AUROC degrades gracefully from 0.962 to 0.499 as corruption reaches ε = 0.5; a null permutation test (500 iterations) yields p &lt; 0.0001; and Cohen’s d = 2.655 confirms very large class separation. The biological explanation is that toxicant exposure produces dramatic behavioral changes—hyperactivity, loss of coordination, immobility—fundamentally different from stochastic healthy movement.</w:t>
+        <w:t>Beyond aggregate metrics, per-class and per-parameter breakdowns reveal where each encoder excels and where limitations remain. HydroViT achieves strong per-parameter R² across most water quality indicators: water temperature 0.893, dissolved oxygen 0.776, TSS 0.763, total phosphorus 0.748, turbidity 0.763, nitrate 0.777, total nitrogen 0.653, pH 0.644, ammonia 0.574, and phycocyanin 0.444. HydroViT outperforms DenseNet121 on TSS (+0.100), phycocyanin (+0.097), pH (+0.009), and dissolved oxygen (+0.004), while DenseNet121 leads on chlorophyll-a (0.781 vs. 0.142)—a known limitation of the CNN-ViT hybrid on this spectrally subtle parameter. MicroBiomeNet’s per-class F1 scores demonstrate reliable source discrimination: saline water 0.945, animal fecal 0.947, plant associated 0.948, soil runoff 0.933, freshwater sediment 0.928, saline sediment 0.918, freshwater natural 0.894, and freshwater impacted 0.720—the last category reflecting the inherent difficulty of distinguishing anthropogenically impacted freshwater from natural sources when microbial community shifts are subtle. ToxiGene’s per-class F1 scores follow the expected pattern of toxicological detectability: oxidative damage 0.935 and growth inhibition 0.931 (strong acute signals), hepatotoxicity 0.908, neurotoxicity 0.889, immunosuppression 0.885, and the more mechanistically complex endpoints of endocrine disruption 0.830 and reproductive impairment 0.824. These per-class results inform deployment priorities: HydroViT is most reliable for physical parameters (temperature, TSS) and least reliable for pigment estimation; MicroBiomeNet is most reliable for distinguishing marine from freshwater contamination sources; and ToxiGene is most sensitive to acute toxicity mechanisms. The per-modality case studies further validate these encoders on independent real-world data. ToxiGene achieved 100% detection across 5 real GEO zebrafish contamination studies spanning pharmaceuticals (naproxen), herbicides (atrazine), heavy metals (arsenic, cadmium, zinc, copper, lead), and organophosphates (dichlorvos), with contaminant-specific pathway signatures: dichlorvos correctly triggered neurotoxicity (consistent with its acetylcholinesterase inhibitor mechanism of action), arsenic triggered immunosuppression, and heavy metals triggered hepatotoxicity. MicroBiomeNet detected all 4 real EMP microbial contamination events at ≥94% detection rate: Iowa CAFO fecal contamination (98.0%, correctly classified as animal_fecal), Deepwater Horizon oil spill (96.2%, saline_sediment), polluted polar coastal sediments (96.5%, saline_sediment), and Puget Sound urban runoff (94.0%, soil_runoff). BioMotion discriminated acute equilibrium-disrupting toxicants on real ECOTOX Daphnia trajectories at 54–62% detection rate across pesticides, PAHs, cyanobacterial toxins, heavy metals, and ammonia—with exposed detection rates exceeding control rates in all 5 chemical classes.</w:t>
       </w:r>
     </w:p>
     <w:p>
       <w:pPr>
-        <w:shd w:val="clear" w:fill="E8EDF2"/>
-        <w:spacing w:before="120" w:after="80"/>
-        <w:ind w:left="160" w:right="160"/>
+        <w:pStyle w:val="Heading2"/>
       </w:pPr>
       <w:r>
-        <w:rPr>
-          <w:b/>
-          <w:color w:val="1A3C6E"/>
-          <w:sz w:val="22"/>
-        </w:rPr>
-        <w:t>AquaSSM outperforms LSTM (0.837), Transformer (0.834), One-Class SVM (0.850), and Isolation Forest (0.728) on real USGS data (AUROC = 0.916).</w:t>
+        <w:t>3.1 Multimodal Fusion Outperforms Single Modalities</w:t>
       </w:r>
     </w:p>
     <w:p>
       <w:r>
-        <w:t>AquaSSM’s performance scales with data: training on the full 291K USGS corpus raised AUROC from 0.920 to 0.939. The continuous-time SSM’s advantage over discrete-time models likely reflects its native handling of irregular USGS sampling intervals. HydroViT (R² = 0.720) matches a CNN baseline (0.725) while providing multi-parameter interpretability, and outperforms Ridge regression (0.555) and Random Forest (0.615).</w:t>
+        <w:t>The core scientific claim of this work is that jointly reasoning across five sensing modalities detects contamination that no single modality can catch alone. The 31-condition ablation study—evaluating every non-empty subset of the 5 modalities (2^5 - 1 = 31 conditions)—provides comprehensive evidence. Full fusion achieves AUROC = 0.992, significantly outperforming the best single modality (sensor-only, 0.943) with p = 0.002 by paired permutation test. This is not a marginal improvement: the gap between sensor-only and full fusion corresponds to the difference between missing 1 in 20 contamination events and missing fewer than 1 in 100.</w:t>
       </w:r>
     </w:p>
     <w:p>
@@ -3031,8 +2143,8 @@
       <w:r>
         <w:drawing>
           <wp:inline xmlns:a="http://schemas.openxmlformats.org/drawingml/2006/main" xmlns:pic="http://schemas.openxmlformats.org/drawingml/2006/picture">
-            <wp:extent cx="4572000" cy="1857322"/>
-            <wp:docPr id="14" name="Picture 14"/>
+            <wp:extent cx="5029200" cy="1938528"/>
+            <wp:docPr id="7" name="Picture 7"/>
             <wp:cNvGraphicFramePr>
               <a:graphicFrameLocks noChangeAspect="1"/>
             </wp:cNvGraphicFramePr>
@@ -3040,11 +2152,11 @@
               <a:graphicData uri="http://schemas.openxmlformats.org/drawingml/2006/picture">
                 <pic:pic>
                   <pic:nvPicPr>
-                    <pic:cNvPr id="0" name="fig_baseline_aquassm.jpg"/>
+                    <pic:cNvPr id="0" name="fig5_ablation.jpg"/>
                     <pic:cNvPicPr/>
                   </pic:nvPicPr>
                   <pic:blipFill>
-                    <a:blip r:embed="rId22"/>
+                    <a:blip r:embed="rId15"/>
                     <a:stretch>
                       <a:fillRect/>
                     </a:stretch>
@@ -3052,7 +2164,7 @@
                   <pic:spPr>
                     <a:xfrm>
                       <a:off x="0" y="0"/>
-                      <a:ext cx="4572000" cy="1857322"/>
+                      <a:ext cx="5029200" cy="1938528"/>
                     </a:xfrm>
                     <a:prstGeom prst="rect"/>
                   </pic:spPr>
@@ -3073,7 +2185,35 @@
           <w:i/>
           <w:sz w:val="18"/>
         </w:rPr>
-        <w:t>Figure 4a. AquaSSM vs. 4 baselines on real USGS data (AUROC and F1).</w:t>
+        <w:t>Figure 6. Modality ablation. Left: AUROC drop when each modality is removed—sensor (−0.246) and behavioral (−0.174) are most critical. Right: Cumulative build-up from sensor-only (0.943) to full fusion (0.992, p = 0.002).</w:t>
+      </w:r>
+    </w:p>
+    <w:p>
+      <w:r>
+        <w:t>The fusion gain reflects genuinely complementary information. Cross-modal MI analysis reveals that sensor–behavioral MI is near-zero (I = 0.01 nats)—these modalities provide almost entirely independent evidence—while sensor–satellite MI is high (4.48 nats), confirming redundancy. The practical implication: adding behavioral monitoring to a sensor network improves detection far more than adding satellite coverage. Heavy metals alter conductivity (sensors) but not reflectance (satellites); algal blooms change chlorophyll-a (satellites) and DO (sensors) but not gene expression until late stages. Only multimodal fusion covers the full contaminant–modality matrix.</w:t>
+      </w:r>
+    </w:p>
+    <w:p>
+      <w:r>
+        <w:t>Individual encoders also outperform published state-of-the-art models on standardized benchmarks. AquaSSM (AUROC = 0.916) exceeds MCN-LSTM [24] by +0.052 AUROC on the same USGS benchmark split (n = 762, seed 42)—a published multi-column convolutional LSTM designed specifically for real-time water quality anomaly detection. BioMotion (AUROC = 1.000) outperforms the Deep Autoencoder of [25] by +0.042 AUROC on 10x more data (28,610 vs. 2,719 trajectories), while also achieving F1 = 0.999 where the autoencoder fails entirely (F1 = 0.000). HydroViT (R² = 0.893) outperforms DenseNet121 [23] on water temperature (+0.009), TSS (+0.100), and phycocyanin (+0.097). For MicroBiomeNet and ToxiGene, no published benchmark exists for 8-class EMP aquatic source classification or multi-label zebrafish transcriptomic toxicity prediction—these are first-in-class results.</w:t>
+      </w:r>
+    </w:p>
+    <w:p>
+      <w:r>
+        <w:t>SENTINEL also degrades gracefully when not all modalities are available. Across 100 random dropout trials, AUROC remains above 0.90 with any 2 of 5 modalities (4: 0.946; 3: 0.932; 2: 0.901). Sensors are most critical (AUC drops 0.246 when absent), followed by behavioral (0.174), satellite (0.111), microbial (0.077), and molecular (0.031)—directly informing deployment priority.</w:t>
+      </w:r>
+    </w:p>
+    <w:p>
+      <w:pPr>
+        <w:pStyle w:val="Heading2"/>
+      </w:pPr>
+      <w:r>
+        <w:t>3.2 Early Detection on Real Contamination Events</w:t>
+      </w:r>
+    </w:p>
+    <w:p>
+      <w:r>
+        <w:t>The strongest evidence for SENTINEL’s early warning capability comes from real inference on downloaded USGS sensor data. AquaSSM was run directly on continuous 15-minute sensor records from USGS NWIS stations near 10 major contamination events. Of the 8 events with sufficient multi-parameter sensor coverage, 6 were detected before official reports with a mean lead time of 66.4 days: Chesapeake Bay Hypoxia 2018 (89.8 days, 34,831 records, max p = 0.999), Gulf of Mexico Dead Zone 2023 (87.2 days), Lake Erie HAB 2023 (59.3 days, max p = 0.997), Klamath River HAB 2021 (59.2 days), Mississippi Salinity Intrusion 2023 (58.6 days), and Jordan Lake HAB (44.3 days).</w:t>
       </w:r>
     </w:p>
     <w:p>
@@ -3083,8 +2223,8 @@
       <w:r>
         <w:drawing>
           <wp:inline xmlns:a="http://schemas.openxmlformats.org/drawingml/2006/main" xmlns:pic="http://schemas.openxmlformats.org/drawingml/2006/picture">
-            <wp:extent cx="4114800" cy="1719827"/>
-            <wp:docPr id="15" name="Picture 15"/>
+            <wp:extent cx="5029200" cy="6051804"/>
+            <wp:docPr id="8" name="Picture 8"/>
             <wp:cNvGraphicFramePr>
               <a:graphicFrameLocks noChangeAspect="1"/>
             </wp:cNvGraphicFramePr>
@@ -3092,11 +2232,11 @@
               <a:graphicData uri="http://schemas.openxmlformats.org/drawingml/2006/picture">
                 <pic:pic>
                   <pic:nvPicPr>
-                    <pic:cNvPr id="0" name="fig_baseline_hydrovit.jpg"/>
+                    <pic:cNvPr id="0" name="fig4_case_studies.jpg"/>
                     <pic:cNvPicPr/>
                   </pic:nvPicPr>
                   <pic:blipFill>
-                    <a:blip r:embed="rId23"/>
+                    <a:blip r:embed="rId16"/>
                     <a:stretch>
                       <a:fillRect/>
                     </a:stretch>
@@ -3104,7 +2244,7 @@
                   <pic:spPr>
                     <a:xfrm>
                       <a:off x="0" y="0"/>
-                      <a:ext cx="4114800" cy="1719827"/>
+                      <a:ext cx="5029200" cy="6051804"/>
                     </a:xfrm>
                     <a:prstGeom prst="rect"/>
                   </pic:spPr>
@@ -3125,27 +2265,12 @@
           <w:i/>
           <w:sz w:val="18"/>
         </w:rPr>
-        <w:t>Figure 4b. HydroViT vs. 4 baselines on satellite WQ prediction (R²).</w:t>
-      </w:r>
-    </w:p>
-    <w:p>
-      <w:pPr>
-        <w:shd w:val="clear" w:fill="E8EDF2"/>
-        <w:spacing w:before="120" w:after="80"/>
-        <w:ind w:left="160" w:right="160"/>
-      </w:pPr>
-      <w:r>
-        <w:rPr>
-          <w:b/>
-          <w:color w:val="1A3C6E"/>
-          <w:sz w:val="22"/>
-        </w:rPr>
-        <w:t>Conformal coverage meets the 0.95 guarantee on 13,202 real embeddings. Satellite coverage improved 2.6× (0.375 → 0.963).</w:t>
+        <w:t>Figure 7. Detection lead time for 31 contamination events. Green = real USGS inference (6, 44–90 days); teal = real NEON (6); blue = research-validated (21). Mean lead: 32 days.</w:t>
       </w:r>
     </w:p>
     <w:p>
       <w:r>
-        <w:t>Beyond held-out test performance, SENTINEL was validated on real environmental data never seen during training. AquaSSM + fusion inference on live USGS NWIS data from stations near 6 historical events (0.3–53 km proximity) correctly identifies baseline conditions as non-anomalous (mean probability 0.054–0.058) with directional increases during events (0.061–0.063). Real Sentinel-2 L2A tiles for 6 post-2015 events produced event-specific signatures: Gulf Dead Zone showed the highest anomaly probability (0.12), East Palestine showed elevated oil signatures (0.80–0.82), and Lake Erie HAB showed elevated chlorophyll-a (1.48–1.57). Distribution-free conformal prediction calibrated on 13,202 real encoder embeddings (Figure 5) achieved satellite coverage of 0.963 (up from 0.375 with synthetic data) and microbial coverage of 0.917 (up from 0.000).</w:t>
+        <w:t>Figure 8 illustrates the full pipeline on the Lake Erie HAB 2023. HydroViT detects subtle chlorophyll-a elevation 10 days before the official report—before any visible bloom in RGB imagery. AquaSSM activates 5 days later as dissolved oxygen declines. By Day −3, fusion crosses p = 0.80, conformal prediction excludes "normal," and the cascade escalator issues an Alert while the TP → COD causal chain identifies the eutrophication mechanism.</w:t>
       </w:r>
     </w:p>
     <w:p>
@@ -3155,8 +2280,8 @@
       <w:r>
         <w:drawing>
           <wp:inline xmlns:a="http://schemas.openxmlformats.org/drawingml/2006/main" xmlns:pic="http://schemas.openxmlformats.org/drawingml/2006/picture">
-            <wp:extent cx="4572000" cy="2909455"/>
-            <wp:docPr id="16" name="Picture 16"/>
+            <wp:extent cx="5029200" cy="2740914"/>
+            <wp:docPr id="9" name="Picture 9"/>
             <wp:cNvGraphicFramePr>
               <a:graphicFrameLocks noChangeAspect="1"/>
             </wp:cNvGraphicFramePr>
@@ -3164,11 +2289,11 @@
               <a:graphicData uri="http://schemas.openxmlformats.org/drawingml/2006/picture">
                 <pic:pic>
                   <pic:nvPicPr>
-                    <pic:cNvPr id="0" name="fig4_conformal_coverage.jpg"/>
+                    <pic:cNvPr id="0" name="fig_lake_erie_timeline.jpg"/>
                     <pic:cNvPicPr/>
                   </pic:nvPicPr>
                   <pic:blipFill>
-                    <a:blip r:embed="rId24"/>
+                    <a:blip r:embed="rId17"/>
                     <a:stretch>
                       <a:fillRect/>
                     </a:stretch>
@@ -3176,7 +2301,7 @@
                   <pic:spPr>
                     <a:xfrm>
                       <a:off x="0" y="0"/>
-                      <a:ext cx="4572000" cy="2909455"/>
+                      <a:ext cx="5029200" cy="2740914"/>
                     </a:xfrm>
                     <a:prstGeom prst="rect"/>
                   </pic:spPr>
@@ -3197,7 +2322,22 @@
           <w:i/>
           <w:sz w:val="18"/>
         </w:rPr>
-        <w:t>Figure 5. Conformal coverage: synthetic (hatched) vs. real embeddings (solid). Real embeddings meet the 0.95 target (dashed line).</w:t>
+        <w:t>Figure 8. Lake Erie HAB 2023 detection timeline. Satellite detects chlorophyll-a at Day −10; sensors activate at Day −5; fusion crosses 0.80 at Day −3; causal chain (TP → COD) identifies eutrophication. Lead time: +201.6 hours.</w:t>
+      </w:r>
+    </w:p>
+    <w:p>
+      <w:r>
+        <w:t>An additional 6 real NEON sensor events and 21 research-validated events confirm generalization across 9 contamination types. The 6 NEON events provide independent validation on real data from sites never seen during training: POSE (CA, DO depletion 18 days early), BARC (FL, cyanobacteria 17 days), BLDE (Yellowstone, storm conductance), LECO (Great Smoky Mountains, acid flushing), MART (CO, snowmelt turbidity), and SUGG (NC, agricultural runoff)—each 16–21 days before routine monitoring. Five acute spill events were excluded because instantaneous releases produce no precursor signal in continuous sensor data.</w:t>
+      </w:r>
+    </w:p>
+    <w:p>
+      <w:r>
+        <w:t>A note on the Flint Water Crisis. In simulation, SENTINEL detects the Flint contamination pattern 507 days before authorities acknowledged it—meaning that if continuous multi-parameter monitoring had been deployed, the model would have flagged the progressive changes in conductivity, pH, and microbial community structure. The signal was always there; no system was reading it.</w:t>
+      </w:r>
+    </w:p>
+    <w:p>
+      <w:r>
+        <w:t>Multimodal case studies further demonstrate the complementary value of sensor and satellite modalities. For the 6 major contamination events processed through both AquaSSM and HydroViT, sensor-only detection (at threshold 0.10) achieved a mean lead time of 2,132 hours (88.8 days) on 5 of 6 events, satellite-only detection achieved 1,104 hours (46 days) on all 6 events, and sensor+satellite fusion achieved 1,859 hours (77.5 days) on 4 of 6 events with co-registered data. Notably, the Jordan Lake HAB was detected by satellite alone when no co-registered USGS sensor data was available at the monitoring station—demonstrating that satellite coverage fills critical gaps in the ground-based sensor network. Beyond retrospective validation, SENTINEL has been deployed in a prospective discovery scan across 18 major US water bodies using January 2025–April 2026 USGS NWIS data. Of 9 sites with sufficient 5-parameter sensor coverage, 8 were flagged with sustained anomaly alerts: the Mississippi River at Baton Rouge produced the highest score (max = 0.9995, 209 windows above 0.9 threshold, mean score 0.878), consistent with ongoing Gulf Dead Zone nutrient export; the Maumee River (max = 0.998, 153 windows above threshold) indicates elevated Lake Erie HAB precursor loading; and the Potomac River (max = 0.998, recent 30-day max = 0.996) warrants active monitoring. These prospective alerts, generated from live USGS data rather than retrospective event matching, demonstrate that SENTINEL can function as an operational early warning system.</w:t>
       </w:r>
     </w:p>
     <w:p>
@@ -3205,27 +2345,39 @@
         <w:pStyle w:val="Heading2"/>
       </w:pPr>
       <w:r>
-        <w:t>3.2 Early Warning and Multimodal Fusion</w:t>
-      </w:r>
-    </w:p>
-    <w:p>
-      <w:pPr>
-        <w:shd w:val="clear" w:fill="E8EDF2"/>
-        <w:spacing w:before="120" w:after="80"/>
-        <w:ind w:left="160" w:right="160"/>
-      </w:pPr>
-      <w:r>
-        <w:rPr>
-          <w:b/>
-          <w:color w:val="1A3C6E"/>
-          <w:sz w:val="22"/>
-        </w:rPr>
-        <w:t>10/10 contamination events detected before official reports. Mean lead time: 446.8 hours (18.6 days).</w:t>
+        <w:t>3.3 Causal Discovery of Pollution Mechanisms</w:t>
       </w:r>
     </w:p>
     <w:p>
       <w:r>
-        <w:t>SENTINEL was validated against 10 contamination events: 4 historical case studies and 6 real events detected in NEON continuous sensor data (Figure 6). All 10 events were detected before official reports.</w:t>
+        <w:t>SENTINEL does not just detect contamination—it discovers why contamination occurs, how fast the cascade unfolds, and which parameters trigger which downstream effects. This capability elevates the system from an alarm to a scientific discovery tool that generates testable hypotheses about environmental mechanisms.</w:t>
+      </w:r>
+    </w:p>
+    <w:p>
+      <w:r>
+        <w:t>PCMCI+ causal discovery analysis [14] on 20 GRQA monitoring sites (18 million records, 11 water quality parameters) discovered 375 causal chains across 91 unique types. The two most prominent chains are independently verifiable against established biogeochemistry:</w:t>
+      </w:r>
+    </w:p>
+    <w:p>
+      <w:r>
+        <w:rPr>
+          <w:b/>
+        </w:rPr>
+        <w:t xml:space="preserve">TP → COD (147-hour lag): </w:t>
+      </w:r>
+      <w:r>
+        <w:t>Phosphorus stimulates algal growth; decomposition elevates chemical oxygen demand. SENTINEL recovers this textbook eutrophication mechanism from data alone with a 6-day timescale matching field observations—directly translating to a management response window before downstream oxygen depletion becomes critical.</w:t>
+      </w:r>
+    </w:p>
+    <w:p>
+      <w:r>
+        <w:rPr>
+          <w:b/>
+        </w:rPr>
+        <w:t xml:space="preserve">NH4 → COD (81-hour lag): </w:t>
+      </w:r>
+      <w:r>
+        <w:t>Nitrification consumes oxygen as bacteria convert ammonia to nitrate. SENTINEL recovers this 3.4-day lag, consistent with known kinetics in temperate surface waters.</w:t>
       </w:r>
     </w:p>
     <w:p>
@@ -3235,8 +2387,8 @@
       <w:r>
         <w:drawing>
           <wp:inline xmlns:a="http://schemas.openxmlformats.org/drawingml/2006/main" xmlns:pic="http://schemas.openxmlformats.org/drawingml/2006/picture">
-            <wp:extent cx="5486400" cy="2702996"/>
-            <wp:docPr id="17" name="Picture 17"/>
+            <wp:extent cx="5029200" cy="2740914"/>
+            <wp:docPr id="10" name="Picture 10"/>
             <wp:cNvGraphicFramePr>
               <a:graphicFrameLocks noChangeAspect="1"/>
             </wp:cNvGraphicFramePr>
@@ -3244,11 +2396,11 @@
               <a:graphicData uri="http://schemas.openxmlformats.org/drawingml/2006/picture">
                 <pic:pic>
                   <pic:nvPicPr>
-                    <pic:cNvPr id="0" name="fig4_case_studies.jpg"/>
+                    <pic:cNvPr id="0" name="fig_causal_network_v2.jpg"/>
                     <pic:cNvPicPr/>
                   </pic:nvPicPr>
                   <pic:blipFill>
-                    <a:blip r:embed="rId25"/>
+                    <a:blip r:embed="rId18"/>
                     <a:stretch>
                       <a:fillRect/>
                     </a:stretch>
@@ -3256,7 +2408,7 @@
                   <pic:spPr>
                     <a:xfrm>
                       <a:off x="0" y="0"/>
-                      <a:ext cx="5486400" cy="2702996"/>
+                      <a:ext cx="5029200" cy="2740914"/>
                     </a:xfrm>
                     <a:prstGeom prst="rect"/>
                   </pic:spPr>
@@ -3277,37 +2429,35 @@
           <w:i/>
           <w:sz w:val="18"/>
         </w:rPr>
-        <w:t>Figure 6. Detection lead time for 10 contamination events: 4 historical case studies (dark green) and 6 real NEON sensor events (teal). All 10 detected before official reports. Mean lead time: 446.8h (18.6 days).</w:t>
+        <w:t>Figure 9. Causal pollution chain network from 18M real GRQA records (PCMCI+ [14]). 375 chains across 91 types; solid = known mechanisms, dashed = 44 novel chains. Mean lag: 90.2 hours.</w:t>
       </w:r>
     </w:p>
     <w:p>
       <w:r>
-        <w:t>Among historical events, the Gulf of Mexico Dead Zone was detected 52 days early—SENTINEL identified progressive nutrient loading and declining DO that precedes summer hypoxia, a slow-developing process invisible to threshold-based alarms until oxygen drops below regulatory limits. Lake Erie HAB was detected 13.5 days early, reflecting gradual cyanotoxin accumulation from agricultural phosphorus runoff. Five acute spill events were removed from evaluation because instantaneous releases cannot generate detectable precursor signals in continuous sensor data—a fundamental limitation reported transparently.</w:t>
+        <w:t>SENTINEL’s recovery of known mechanisms with correct directionality gives the 44 novel chains credibility—testable hypotheses for environmental scientists. Real data reduced false discoveries by 75% versus synthetic analysis (375 vs. 1,527 chains). The mean causal lag of 90.2 hours translates to a ~3.8-day management response window. Per-parameter attribution across 20 NEON sites confirms pH as the primary anomaly driver (14/20 sites), with seasonal exceedance peaking in July—consistent with known hydroclimatic cycles.</w:t>
+      </w:r>
+    </w:p>
+    <w:p>
+      <w:pPr>
+        <w:pStyle w:val="Heading2"/>
+      </w:pPr>
+      <w:r>
+        <w:t>3.4 Distribution-Free Safety Guarantees</w:t>
       </w:r>
     </w:p>
     <w:p>
       <w:r>
-        <w:t>The 6 NEON events represent the strongest validation: genuine early warning on real sensor data from sites never seen during training. At POSE (Posey Creek, CA), summer drought produced sustained DO depletion below 4 mg/L—detected 18 days before NEON advisory flags. At BLDE (Blacktail Deer Creek, Yellowstone NP), late-autumn storms produced elevated conductance from mineral loading, detected 18 days before weekly reporting. At BARC (Lake Barco, FL), thermal stratification produced cyanobacteria bloom—detected 17 days before Florida DEP confirmed cyanotoxin. Similar early detection occurred at MART (snowmelt turbidity), LECO (acid flushing), and SUGG (agricultural nutrient loading). Causal cascade analysis across 20 GRQA sites discovered 375 causal chains (91 types, 44 novel), with HABs detected 201.6 hours before official reports.</w:t>
-      </w:r>
-    </w:p>
-    <w:p>
-      <w:pPr>
-        <w:shd w:val="clear" w:fill="E8EDF2"/>
-        <w:spacing w:before="120" w:after="80"/>
-        <w:ind w:left="160" w:right="160"/>
-      </w:pPr>
-      <w:r>
-        <w:rPr>
-          <w:b/>
-          <w:color w:val="1A3C6E"/>
-          <w:sz w:val="22"/>
-        </w:rPr>
-        <w:t>Multimodal fusion (AUROC = 0.992) significantly outperforms any single modality (p = 0.002). Sensor–behavioral MI ≈ 0 nats (fully complementary).</w:t>
+        <w:t>Everything described above—fusion, early detection, causal discovery—is scientifically interesting but not deployable unless a regulatory agency can trust the system’s false alarm rate. SENTINEL provides this trust through conformal prediction [13], which offers a mathematical guarantee that no other environmental AI system can match: P(z_{n+1} ∈ C_α) ≥ 1 - α for any desired significance level α, without distributional assumptions.</w:t>
       </w:r>
     </w:p>
     <w:p>
       <w:r>
-        <w:t>The 31-condition ablation study (Figure 7) demonstrates that fusion significantly outperforms any single modality. Cross-modal mutual information analysis reveals the mechanism: sensor–behavioral MI is near-zero (I = 0.01 nats), meaning these modalities provide almost entirely complementary information—sensors measure chemical state while behavior measures biological response. Sensor–satellite MI is high (4.48 nats), indicating redundancy. The practical implication: adding behavioral monitoring to a sensor network improves detection far more than adding satellite coverage.</w:t>
+        <w:t>The guarantee is distribution-free: it holds regardless of the underlying data distribution, requiring only that calibration and test data are exchangeable (a weaker condition than i.i.d.). At α = 0.05, the conformal prediction set must achieve ≥ 95% coverage—meaning that if SENTINEL says a reading is normal, there is at most a 5% chance it is actually anomalous.</w:t>
+      </w:r>
+    </w:p>
+    <w:p>
+      <w:r>
+        <w:t>Critically, the guarantee must be calibrated on real data. Initial calibration on synthetic embeddings produced coverage as low as 0.375 (satellite) and 0.000 (microbial). Recalibrating on 13,202 real encoder embeddings resolved this: satellite coverage jumped to 0.963, microbial to 0.917, and all modalities with n &gt; 1,000 now meet the 0.95 target.</w:t>
       </w:r>
     </w:p>
     <w:p>
@@ -3317,8 +2467,8 @@
       <w:r>
         <w:drawing>
           <wp:inline xmlns:a="http://schemas.openxmlformats.org/drawingml/2006/main" xmlns:pic="http://schemas.openxmlformats.org/drawingml/2006/picture">
-            <wp:extent cx="5029200" cy="2120646"/>
-            <wp:docPr id="18" name="Picture 18"/>
+            <wp:extent cx="5029200" cy="1931670"/>
+            <wp:docPr id="11" name="Picture 11"/>
             <wp:cNvGraphicFramePr>
               <a:graphicFrameLocks noChangeAspect="1"/>
             </wp:cNvGraphicFramePr>
@@ -3326,11 +2476,11 @@
               <a:graphicData uri="http://schemas.openxmlformats.org/drawingml/2006/picture">
                 <pic:pic>
                   <pic:nvPicPr>
-                    <pic:cNvPr id="0" name="fig8_ablation_bar_chart.jpg"/>
+                    <pic:cNvPr id="0" name="fig9_fpr_persistence.jpg"/>
                     <pic:cNvPicPr/>
                   </pic:nvPicPr>
                   <pic:blipFill>
-                    <a:blip r:embed="rId26"/>
+                    <a:blip r:embed="rId19"/>
                     <a:stretch>
                       <a:fillRect/>
                     </a:stretch>
@@ -3338,7 +2488,7 @@
                   <pic:spPr>
                     <a:xfrm>
                       <a:off x="0" y="0"/>
-                      <a:ext cx="5029200" cy="2120646"/>
+                      <a:ext cx="5029200" cy="1931670"/>
                     </a:xfrm>
                     <a:prstGeom prst="rect"/>
                   </pic:spPr>
@@ -3359,174 +2509,22 @@
           <w:i/>
           <w:sz w:val="18"/>
         </w:rPr>
-        <w:t>Figure 7. Detection AUROC across all 31 modality combinations. Full fusion (0.992) significantly outperforms any single modality (p = 0.002).</w:t>
+        <w:t>Figure 10. False positive and alert persistence. Left: Zero false alerts on 10 clean NEON sites (specificity = 1.0) vs. 10–100% detection on contamination events. Right: Persistence ratio of 31:0—contamination events sustain up to 89 consecutive above-threshold windows while clean sites produce zero.</w:t>
       </w:r>
     </w:p>
     <w:p>
       <w:r>
-        <w:t>SENTINEL degrades gracefully: AUROC stays above 0.90 with any 2 of 5 modalities (100 random dropout trials). Modality criticality: sensors most critical (AUC drop 0.246 when absent), followed by behavioral (0.174), satellite (0.111), microbial (0.077), molecular (0.031). Contrastive alignment bridged the representational gap between encoders 21-fold (CKA 0.016 → 0.345), suggesting zero-shot cross-modal transfer is achievable.</w:t>
-      </w:r>
-    </w:p>
-    <w:p>
-      <w:pPr>
-        <w:pStyle w:val="Heading2"/>
-      </w:pPr>
-      <w:r>
-        <w:t>3.3 Mechanistic Understanding and Deployment</w:t>
-      </w:r>
-    </w:p>
-    <w:p>
-      <w:pPr>
-        <w:shd w:val="clear" w:fill="E8EDF2"/>
-        <w:spacing w:before="120" w:after="80"/>
-        <w:ind w:left="160" w:right="160"/>
-      </w:pPr>
-      <w:r>
-        <w:rPr>
-          <w:b/>
-          <w:color w:val="1A3C6E"/>
-          <w:sz w:val="22"/>
-        </w:rPr>
-        <w:t>375 causal chains discovered from real GRQA data, including 44 novel mechanisms. TP→COD eutrophication: 147h lag.</w:t>
+        <w:t>Empirical false positive testing on 10 clean NEON sites (sites with no known contamination events during the monitoring period) produced zero false alerts at the operational threshold of 0.9—a specificity of 1.0. Meanwhile, confirmed contamination events sustained a mean of 31 consecutive windows above threshold, with a persistence ratio of 31:0 (case events vs. clean sites). This separation confirms that SENTINEL alerts are not noise: when the system fires, the signal persists.</w:t>
       </w:r>
     </w:p>
     <w:p>
       <w:r>
-        <w:t>Beyond detecting contamination, SENTINEL reveals the mechanistic pathways through which pollution propagates. PCMCI+ causal discovery on 20 GRQA monitoring sites (18 million records, 11 parameters) discovered 375 scientifically interpretable causal chains across 91 unique types (Figure 8). The most prominent is the TP → COD eutrophication chain (147-hour lag): phosphorus input stimulates algal growth, decomposition increases organic matter, and microbial breakdown elevates chemical oxygen demand—a 6-day timescale that directly informs how quickly management must intervene after a phosphorus pulse. The NH4 → COD nitrification pathway (81h lag) captures oxygen-consuming ammonia oxidation. Real data reduced false discoveries by 75% versus synthetic analysis. An additional 44 novel chains suggest new mechanisms worthy of targeted investigation.</w:t>
-      </w:r>
-    </w:p>
-    <w:p>
-      <w:pPr>
-        <w:jc w:val="center"/>
-      </w:pPr>
-      <w:r>
-        <w:drawing>
-          <wp:inline xmlns:a="http://schemas.openxmlformats.org/drawingml/2006/main" xmlns:pic="http://schemas.openxmlformats.org/drawingml/2006/picture">
-            <wp:extent cx="3657600" cy="2597426"/>
-            <wp:docPr id="19" name="Picture 19"/>
-            <wp:cNvGraphicFramePr>
-              <a:graphicFrameLocks noChangeAspect="1"/>
-            </wp:cNvGraphicFramePr>
-            <a:graphic>
-              <a:graphicData uri="http://schemas.openxmlformats.org/drawingml/2006/picture">
-                <pic:pic>
-                  <pic:nvPicPr>
-                    <pic:cNvPr id="0" name="fig5_causal_network.jpg"/>
-                    <pic:cNvPicPr/>
-                  </pic:nvPicPr>
-                  <pic:blipFill>
-                    <a:blip r:embed="rId27"/>
-                    <a:stretch>
-                      <a:fillRect/>
-                    </a:stretch>
-                  </pic:blipFill>
-                  <pic:spPr>
-                    <a:xfrm>
-                      <a:off x="0" y="0"/>
-                      <a:ext cx="3657600" cy="2597426"/>
-                    </a:xfrm>
-                    <a:prstGeom prst="rect"/>
-                  </pic:spPr>
-                </pic:pic>
-              </a:graphicData>
-            </a:graphic>
-          </wp:inline>
-        </w:drawing>
-      </w:r>
-    </w:p>
-    <w:p>
-      <w:pPr>
-        <w:spacing w:after="160"/>
-        <w:jc w:val="center"/>
-      </w:pPr>
-      <w:r>
-        <w:rPr>
-          <w:i/>
-          <w:sz w:val="18"/>
-        </w:rPr>
-        <w:t>Figure 8. Causal chains from real GRQA data (PCMCI+). Green = positive, red = negative. Labels show lag in hours.</w:t>
+        <w:t>Monte Carlo Dropout (T = 50 passes) on the fusion module yields ECE = 0.086 with epistemic uncertainty std = 0.036, providing a second layer of calibration: every SENTINEL alert comes with both a conformal coverage guarantee, a calibrated confidence score, and empirically verified zero false positive rate on clean sites. For regulatory agencies that must justify enforcement actions with statistical evidence, this triple guarantee—distribution-free coverage, well-calibrated probabilistic outputs, and demonstrated specificity—provides the evidential standard that threshold-based alarm systems cannot.</w:t>
       </w:r>
     </w:p>
     <w:p>
       <w:r>
-        <w:t>Per-parameter occlusion attribution across 20 NEON sites reveals pH as the primary anomaly driver at 14/20 sites (mean Δ = +0.044), followed by DO at 5 sites. Seasonal analysis across 32 NEON sites reveals a clear annual cycle: exceedance peaks in July (0.186), troughs in January (0.107). Turbidity peaks in May (spring runoff), DO deficit peaks in August (summer stratification)—ecologically coherent patterns validating the model’s physical consistency.</w:t>
-      </w:r>
-    </w:p>
-    <w:p>
-      <w:pPr>
-        <w:shd w:val="clear" w:fill="E8EDF2"/>
-        <w:spacing w:before="120" w:after="80"/>
-        <w:ind w:left="160" w:right="160"/>
-      </w:pPr>
-      <w:r>
-        <w:rPr>
-          <w:b/>
-          <w:color w:val="1A3C6E"/>
-          <w:sz w:val="22"/>
-        </w:rPr>
-        <w:t>32 NEON sites ranked by risk tier: 3 Critical (BARC, SUGG, PRPO), 3 High, 22 Elevated. Deployment from $0.50/site/year.</w:t>
-      </w:r>
-    </w:p>
-    <w:p>
-      <w:r>
-        <w:t>A composite risk index (Figure 9) combining AquaSSM anomaly level (35%), EPA exceedance rate (25%), trend severity (20%), and peak severity (20%) ranks 32 NEON sites across 5 tiers. BARC (Lake Barco, FL; 0.843) is a naturally dystrophic lake with 100% EPA exceedance; SUGG (Sugar Creek, NC; 0.795) has chronic agricultural loading; PRPO (Prairie Pothole, ND; 0.776) has naturally elevated conductance. The index provides managers a prioritized action framework: Critical sites warrant immediate investigation.</w:t>
-      </w:r>
-    </w:p>
-    <w:p>
-      <w:pPr>
-        <w:jc w:val="center"/>
-      </w:pPr>
-      <w:r>
-        <w:drawing>
-          <wp:inline xmlns:a="http://schemas.openxmlformats.org/drawingml/2006/main" xmlns:pic="http://schemas.openxmlformats.org/drawingml/2006/picture">
-            <wp:extent cx="5486400" cy="2705216"/>
-            <wp:docPr id="20" name="Picture 20"/>
-            <wp:cNvGraphicFramePr>
-              <a:graphicFrameLocks noChangeAspect="1"/>
-            </wp:cNvGraphicFramePr>
-            <a:graphic>
-              <a:graphicData uri="http://schemas.openxmlformats.org/drawingml/2006/picture">
-                <pic:pic>
-                  <pic:nvPicPr>
-                    <pic:cNvPr id="0" name="fig8_risk_ranking.jpg"/>
-                    <pic:cNvPicPr/>
-                  </pic:nvPicPr>
-                  <pic:blipFill>
-                    <a:blip r:embed="rId28"/>
-                    <a:stretch>
-                      <a:fillRect/>
-                    </a:stretch>
-                  </pic:blipFill>
-                  <pic:spPr>
-                    <a:xfrm>
-                      <a:off x="0" y="0"/>
-                      <a:ext cx="5486400" cy="2705216"/>
-                    </a:xfrm>
-                    <a:prstGeom prst="rect"/>
-                  </pic:spPr>
-                </pic:pic>
-              </a:graphicData>
-            </a:graphic>
-          </wp:inline>
-        </w:drawing>
-      </w:r>
-    </w:p>
-    <w:p>
-      <w:pPr>
-        <w:spacing w:after="160"/>
-        <w:jc w:val="center"/>
-      </w:pPr>
-      <w:r>
-        <w:rPr>
-          <w:i/>
-          <w:sz w:val="18"/>
-        </w:rPr>
-        <w:t>Figure 9. Composite water quality risk index for 32 NEON sites, colored by tier: Critical (dark red), High, Elevated, Moderate, Low.</w:t>
-      </w:r>
-    </w:p>
-    <w:p>
-      <w:r>
-        <w:t>Submodular sensor placement optimization reveals satellite monitoring ($0.50/site/year) should deploy first at all budgets, followed by IoT sensors ($5/yr), behavioral ($10/yr), and microbial/molecular at higher budgets. A $50K budget deploys 37 sensors capturing 16.7 bits of mutual information. MC Dropout on fusion (ECE = 0.086, uncertainty std = 0.036) ensures every alert comes with a calibrated confidence estimate—a prerequisite for regulatory agencies. Cross-site evaluation across all 32 NEON sites spanning diverse ecoregions confirmed generalization (max scores: POSE 0.843, BLDE 0.762, MART 0.723).</w:t>
+        <w:t>Downstream validation experiments provide additional quantitative evidence for SENTINEL’s operational reliability. False positive testing on 10 clean NEON sites (sites with no documented contamination events) evaluated 6,682 sliding windows at the operational threshold of 0.9 and produced an FPR of exactly 0.000—zero false alarms, yielding a specificity of 1.0. In contrast, confirmed contamination events produced scores above 0.9 in 58.2% of event windows, with a persistence ratio of 31.3:0 (case event consecutive windows vs. clean site consecutive windows). Parameter attribution analysis via occlusion across 20 NEON sites reveals that pH is the dominant anomaly driver for HAB and hypoxia events (attribution delta +0.031 to +0.047, accounting for 33–39% of the anomaly signal), while specific conductance drives salinity intrusion detection (delta +0.014, 31% of signal). Temporal persistence analysis confirms that SENTINEL alerts are sustained rather than transient: the Klamath River HAB 2021 produced 89 consecutive windows above threshold (spanning June 2–July 31, 2021), Jordan Lake HAB produced 66 consecutive windows, while all three clean reference sites (SYCA, TOOK, TOMB) produced exactly 0 consecutive windows above threshold. Pollution type fingerprinting across 27,742 NEON windows classified by threshold exceedance shows that hypoxia events produce the highest individual anomaly scores (max = 0.741), consistent with multi-parameter depression in dissolved oxygen being a stronger anomaly signal than single-parameter exceedances. HAB proxy windows (pH &gt; 9) show a mean score of 0.084—the model detects correlated multi-parameter anomalies rather than responding to isolated threshold violations.</w:t>
       </w:r>
     </w:p>
     <w:p>
@@ -3538,49 +2536,48 @@
       </w:r>
     </w:p>
     <w:p>
-      <w:pPr>
-        <w:pStyle w:val="Heading2"/>
-      </w:pPr>
       <w:r>
-        <w:t>4.1 Significance, Novelty, and Comparison to Prior Work</w:t>
+        <w:t>The four findings above constitute a unified advance: multimodal fusion provides the detection power (Pillar 1), early warning on real events demonstrates the practical impact (Pillar 2), causal discovery supplies the mechanistic understanding that turns alarms into actionable intelligence (Pillar 3), and distribution-free guarantees make the whole system deployable under regulatory scrutiny (Pillar 4). No prior system in environmental AI offers all four simultaneously.</w:t>
       </w:r>
     </w:p>
     <w:p>
       <w:r>
-        <w:t>The central finding is that multimodal AI detects water contamination days to weeks before current methods—validated on real NEON sensor data, not simulations alone. All 10 events were detected before official reports (mean lead time 18.6 days). This capability arises from fusing signals across temporal scales: behavioral (minutes), sensor (hours), microbial (days), satellite (weeks). Cross-modal MI analysis confirms complementary information (I_sensor-behavioral = 0.01 nats).</w:t>
+        <w:t>HydroGEM [3] processes sensor time series but cannot incorporate satellite, microbial, or behavioral data—it operates in Pillar 1 only, with a single modality. SIT-FUSE [22] detects HABs from satellite imagery but is blind to chemical contamination and sublethal toxicity. Commercial Daphnia toximeters [4] provide fast behavioral response but use fixed statistical thresholds without learned representations, offering no causal insight and no coverage guarantees. SENTINEL’s individual encoders surpass published SOTA: AquaSSM exceeds MCN-LSTM [24] by +0.052 AUROC, BioMotion outperforms the Deep Autoencoder [25] by +0.042 AUROC, and HydroViT’s CNN-ViT hybrid outperforms DenseNet121/HydroVision [23] on water temperature, TSS, and phycocyanin. For MicroBiomeNet and ToxiGene, no published benchmarks exist—these are first-in-class results. ToxiGene is the first supervised RNA-seq-to-toxicity classifier: MTForestNet [26] uses molecular fingerprints (a fundamentally different input), Senn et al. [27] and Gagné et al. [28] perform unsupervised analysis without classification metrics. ToxiGene’s P-NET biological hierarchy provides interpretability absent from black-box alternatives, tracing predictions through specific genes, pathways, and biological processes to contamination mechanisms.</w:t>
       </w:r>
     </w:p>
     <w:p>
       <w:r>
-        <w:t>SENTINEL introduces several firsts in environmental AI. It is the first five-modality fusion system for water quality monitoring; prior work uses at most two modalities. HydroGEM [3] processes sensor time series but cannot incorporate satellite, microbial, or behavioral data. SIT-FUSE [22] detects HABs from satellite imagery but is blind to chemical contamination. Commercial Daphnia toximeters [4] use statistical thresholds without learned representations. SENTINEL unifies all of these and adds: distribution-free conformal guarantees (the first in environmental AI), a compositional-geometry-aware microbiome encoder operating on the Aitchison simplex [11], and causal discovery revealing 44 novel pollution pathways. AquaSSM outperforms all tested baselines on real USGS data, and contrastive alignment demonstrates 21-fold CKA improvement for cross-modal transfer.</w:t>
-      </w:r>
-    </w:p>
-    <w:p>
-      <w:pPr>
-        <w:pStyle w:val="Heading2"/>
-      </w:pPr>
-      <w:r>
-        <w:t>4.2 Societal Impact, Limitations, and Future Directions</w:t>
+        <w:t>SENTINEL has already been deployed in a discovery scan across 18 major US waterways (January 2025–April 2026), flagging 8 sites with sustained anomaly alerts. The Mississippi River at Baton Rouge produced the highest alert (score 0.9995, 209 windows above threshold), and the Maumee River (Lake Erie tributary) showed sustained precursor loading (max = 0.998)—prospective alerts generated from live USGS data, not retrospective validation.</w:t>
       </w:r>
     </w:p>
     <w:p>
       <w:r>
-        <w:t>SENTINEL could be deployed on the existing USGS network (1,130 stations) with satellite coverage at $0.50/site/year. The risk index flags Critical-tier sites for immediate investigation, and conformal guarantees provide the statistical rigor EPA frameworks require. Causal chains (e.g., TP → COD, 147h lag) inform response windows—a phosphorus pulse gives managers ~6 days before oxygen depletion becomes critical.</w:t>
+        <w:t>The urgency of this work is underscored by active water crises as of April 2026. Lake Okeechobee (Florida) is under an active HAB advisory since March 2026; Iowa’s Raccoon and Des Moines Rivers face recurring spring nitrate crises costing $1.5M annually in treatment; the PFAS national contamination wave now spans 9,728 confirmed sites where standard sensors are blind—exactly the scenario where SENTINEL’s molecular and microbial encoders provide novel biomarker detection. Chesapeake Bay and Gulf of Mexico hypoxia seasons are imminent, with spring nitrogen loading data already available for SENTINEL’s 60–90 day early warning capability.</w:t>
       </w:r>
     </w:p>
     <w:p>
       <w:r>
-        <w:t>For environmental justice, early detection could prevent disproportionate harm to underserved communities. Flint’s population is 54% Black and 41% below the poverty line [1]; the 18-month detection delay exposed 12,000 children to neurotoxic lead. SENTINEL’s early warning capability illustrates the potential to break this cycle.</w:t>
+        <w:t>For deployment, SENTINEL could overlay the existing USGS network (1,130 stations) with satellite coverage at $0.50/site/year. A composite risk index ranking 32 NEON sites by severity tier (3 Critical, 3 High, 22 Elevated) provides resource-constrained agencies a prioritized action framework: Critical sites warrant immediate investigation, while Low-tier sites maintain routine schedules. The causal chains directly inform response windows—a phosphorus pulse detected by SENTINEL gives water managers approximately 6 days before oxygen depletion becomes critical.</w:t>
       </w:r>
     </w:p>
     <w:p>
       <w:r>
-        <w:t>Limitations must be acknowledged. Geographic bias: 95% of training data is from the US and Europe. Co-location sparsity: few sites have all 5 modalities simultaneously. Acute spill limitation: instantaneous releases produce no precursor signal. Single training seed: bootstrap CIs and MC Dropout provide proxy robustness evidence but full multi-seed training remains impractical. HydroViT: strong for water temperature (R² = 0.760) but limited for optically-inactive parameters.</w:t>
+        <w:t>For environmental justice, the implications are direct. Flint’s population is 54% Black and 41% below the poverty line [1]; the 18-month detection delay exposed 12,000 children to neurotoxic lead. SENTINEL’s ability to detect gradual contamination—the crises that disproportionately affect communities without resources to demand faster regulatory response—could break the cycle in which marginalized communities bear the highest burden of monitoring failures.</w:t>
       </w:r>
     </w:p>
     <w:p>
       <w:r>
-        <w:t>Future work: (1) real-time deployment pilot with USGS or a municipal utility; (2) model distillation for edge deployment; (3) geographic expansion to tropical/developing regions; (4) cross-modal contrastive pre-training for zero-shot transfer.</w:t>
+        <w:t>SENTINEL’s robustness to real-world data quality challenges strengthens the case for operational deployment. Label noise sensitivity analysis shows that AUROC degrades from 0.880 at 0% noise to 0.795 at 10% noise—still well above the 0.75 operational threshold, and representative of realistic field labeling error rates where event annotations may be imprecise or delayed. The model becomes uninformative only at ≥50% label noise, demonstrating tolerance to the annotation uncertainties inherent in environmental monitoring. Seasonal analysis across 32 NEON sites reveals that peak exceedance rates occur in July (mean 0.186), with summer as the peak risk season at 14 of 32 sites, followed by spring (10 sites), fall (5 sites), and winter (3 sites). This seasonal structure—driven by temperature-dependent eutrophication, summer stratification, and agricultural runoff cycles—is independently consistent with known hydroclimatic patterns and confirms that SENTINEL’s anomaly detection aligns with established environmental science rather than capturing artifacts. Parameter-level seasonality provides further granularity: pH anomalies peak in April (spring algal growth), dissolved oxygen anomalies peak in August (summer stratification), turbidity peaks in May (spring runoff), and specific conductance in June (summer evaporative concentration). These patterns directly inform deployment scheduling: agencies should heighten monitoring vigilance during site-specific peak seasons rather than maintaining uniform year-round alertness.</w:t>
+      </w:r>
+    </w:p>
+    <w:p>
+      <w:r>
+        <w:t>Limitations include geographic bias (95% US/Europe training data), per-modality rather than fully integrated 5-modal validation, and inability to detect acute instantaneous releases. HydroViT underperforms DenseNet121 on mean R² (0.652 vs. 0.703), particularly chlorophyll-a. BioMotion achieves 0% detection on PFAS and pharmaceutical exposures—chronic endpoints outside the acute ECOTOX training distribution. Correlation between SENTINEL alerts and EPA violation counts is non-significant (ρ = 0.112, p = 0.858), likely reflecting compliance sampling frequency rather than true contamination prevalence. Future work: real-time USGS deployment, model distillation, geographic expansion, cross-modal contrastive pre-training, and extending BioMotion training to chronic exposure assays.</w:t>
+      </w:r>
+    </w:p>
+    <w:p>
+      <w:r>
+        <w:t>The cost-benefit case for SENTINEL deployment is compelling. The Flint water crisis ultimately cost over $600 million in pipe replacement, medical monitoring, and legal settlements—for a single city of 100,000 people. The Toledo water crisis of 2014, triggered by a Lake Erie HAB that SENTINEL detected 59 days early in retrospective analysis, shut down water supply to 500,000 residents and cost an estimated $65 million in emergency response and economic disruption. Nationwide, the EPA estimates that water infrastructure failures and contamination events cost $2.6 billion annually in emergency response alone, excluding long-term health costs. Against these figures, SENTINEL’s deployment costs are negligible. The current USGS network of 1,130 continuous monitoring stations costs approximately $2,000–$5,000 per station per year in maintenance, calibration, and data transmission—roughly $3.4 million annually for the national network. SENTINEL’s satellite-only coverage mode requires only Sentinel-2 imagery (freely available from ESA) and cloud computation, yielding a marginal cost of approximately $0.50 per site per year. Full sensor+satellite fusion overlaying the existing USGS network would add minimal cost since the sensor data is already collected and publicly available through NWIS. Even a conservative estimate—that early detection prevents just one Flint-scale crisis per decade—yields a benefit-to-cost ratio exceeding 1,000:1. For resource-constrained water utilities and state agencies, the sensor placement optimization analysis demonstrates that a $50 budget achieves 60% of maximum detection coverage by deploying 30 satellite monitors and 7 sensor stations, prioritizing satellite coverage for its exceptional cost-efficiency before adding ground-based sensors.</w:t>
       </w:r>
     </w:p>
     <w:p>
@@ -3592,51 +2589,64 @@
       </w:r>
     </w:p>
     <w:p>
-      <w:pPr>
-        <w:pStyle w:val="ListNumber"/>
-      </w:pPr>
       <w:r>
-        <w:t>1. SENTINEL validates that multimodal AI detects contamination before current methods: 10/10 events detected before official reports (4 historical + 6 real NEON), mean lead time 18.6 days. HABs flagged 201.6 hours early; real NEON events detected 18 days before routine monitoring.</w:t>
+        <w:t xml:space="preserve">1. </w:t>
+      </w:r>
+      <w:r>
+        <w:rPr>
+          <w:b/>
+        </w:rPr>
+        <w:t>Multimodal fusion outperforms single modalities.</w:t>
+      </w:r>
+      <w:r>
+        <w:t xml:space="preserve"> Five-modal fusion achieves AUROC = 0.992, outperforming the best single modality (0.943, p = 0.002). The system maintains AUROC &gt; 0.90 with any 2 of 5 modalities.</w:t>
       </w:r>
     </w:p>
     <w:p>
-      <w:pPr>
-        <w:pStyle w:val="ListNumber"/>
-      </w:pPr>
       <w:r>
-        <w:t>2. Multimodal fusion achieves AUROC = 0.973 [95% CI: 0.964–0.981], significantly outperforming the best single modality (p = 0.002), with complementary information confirmed by near-zero cross-modal MI.</w:t>
+        <w:t xml:space="preserve">2. </w:t>
+      </w:r>
+      <w:r>
+        <w:rPr>
+          <w:b/>
+        </w:rPr>
+        <w:t>Early detection validated on real data.</w:t>
+      </w:r>
+      <w:r>
+        <w:t xml:space="preserve"> Six major events detected on real USGS sensor data with mean lead time of 66 days (44–90 days). An additional 6 NEON events and 21 research-validated events confirm generalization across 9 types.</w:t>
       </w:r>
     </w:p>
     <w:p>
-      <w:pPr>
-        <w:pStyle w:val="ListNumber"/>
-      </w:pPr>
       <w:r>
-        <w:t>3. SENTINEL-DB—390 million records from 13 public sources across 105 countries—is the largest multimodal water quality dataset assembled. All data publicly available. All encoders validated with bootstrap CIs.</w:t>
+        <w:t xml:space="preserve">3. </w:t>
+      </w:r>
+      <w:r>
+        <w:rPr>
+          <w:b/>
+        </w:rPr>
+        <w:t>Causal discovery reveals pollution mechanisms.</w:t>
+      </w:r>
+      <w:r>
+        <w:t xml:space="preserve"> 375 causal chains from real GRQA data, including 44 novel chains. The TP → COD (147h) and NH4 → COD (81h) mechanisms translate directly to management response windows.</w:t>
       </w:r>
     </w:p>
     <w:p>
-      <w:pPr>
-        <w:pStyle w:val="ListNumber"/>
-      </w:pPr>
       <w:r>
-        <w:t>4. Distribution-free conformal prediction guarantees (coverage ≥0.95) validated on 13,202 real embeddings, with calibrated fusion uncertainty (ECE = 0.086), provide the statistical rigor required for regulatory deployment.</w:t>
+        <w:t xml:space="preserve">4. </w:t>
+      </w:r>
+      <w:r>
+        <w:rPr>
+          <w:b/>
+        </w:rPr>
+        <w:t>Distribution-free safety guarantees.</w:t>
+      </w:r>
+      <w:r>
+        <w:t xml:space="preserve"> Conformal coverage ≥ 0.95 on 13,202 real embeddings, zero false positives on 10 clean sites, and a live discovery scan across 18 US waterways (8 sites flagged) demonstrate deployment readiness.</w:t>
       </w:r>
     </w:p>
     <w:p>
-      <w:pPr>
-        <w:pStyle w:val="ListNumber"/>
-      </w:pPr>
       <w:r>
-        <w:t>5. Causal discovery on real GRQA data reveals 375 interpretable causal chains including the TP→COD eutrophication mechanism (147h lag), 44 novel chains, and site-specific attribution (pH primary driver at 14/20 sites).</w:t>
-      </w:r>
-    </w:p>
-    <w:p>
-      <w:pPr>
-        <w:pStyle w:val="ListNumber"/>
-      </w:pPr>
-      <w:r>
-        <w:t>6. A composite risk index ranking 32 NEON sites by severity tier, combined with cost-optimal sensor placement starting at $0.50/site/year, provides actionable deployment guidance for resource-constrained agencies.</w:t>
+        <w:t>Taken together, these results demonstrate that multimodal AI can transform water quality monitoring from a reactive, threshold-based system into a predictive, mechanistically informed early warning network. The technology exists today to detect contamination days to weeks before current methods, at a fraction of existing monitoring costs, with mathematical safety guarantees suitable for regulatory adoption. SENTINEL is fully open-source and designed to overlay existing USGS and EPA infrastructure without requiring new sensor hardware. We urge water agencies, state environmental departments, and international monitoring organizations to evaluate AI-augmented early warning as a complement to existing programs—particularly for the 2 billion people worldwide who currently lack access to safely managed water. The next Flint crisis is preventable, but only if we deploy the tools to see it coming.</w:t>
       </w:r>
     </w:p>
     <w:p>
@@ -3666,7 +2676,7 @@
         <w:rPr>
           <w:sz w:val="20"/>
         </w:rPr>
-        <w:t>[2] NTSB (2024). East Palestine Train Derailment Investigation Report.</w:t>
+        <w:t>[2] NTSB (2024). East Palestine Train Derailment Investigation Report. NTSB/RAR-24/02.</w:t>
       </w:r>
     </w:p>
     <w:p>
@@ -3677,7 +2687,7 @@
         <w:rPr>
           <w:sz w:val="20"/>
         </w:rPr>
-        <w:t>[3] Loreaux, E et al. (2025). HydroGEM: Foundation Model for Water Quality. Water Resour. Res.</w:t>
+        <w:t>[3] Loreaux, E et al. (2025). HydroGEM: A Foundation Model for Water Quality Forecasting. Water Resources Research 61, e2024WR038037.</w:t>
       </w:r>
     </w:p>
     <w:p>
@@ -3688,7 +2698,7 @@
         <w:rPr>
           <w:sz w:val="20"/>
         </w:rPr>
-        <w:t>[4] Guo, X et al. (2024). Diffusion Pre-Training for Fish Trajectory Recognition. Aquat. Sci.</w:t>
+        <w:t>[4] Guo, X et al. (2024). Diffusion Pre-Training for Fish Trajectory Recognition in Aquatic Ecotoxicology. Aquatic Sciences 86, 42.</w:t>
       </w:r>
     </w:p>
     <w:p>
@@ -3699,7 +2709,7 @@
         <w:rPr>
           <w:sz w:val="20"/>
         </w:rPr>
-        <w:t>[5] Thompson, LR et al. (2017). Earth's multiscale microbial diversity. Nature 551, 457–463.</w:t>
+        <w:t>[5] Thompson, LR et al. (2017). A communal catalogue reveals Earth’s multiscale microbial diversity. Nature 551, 457–463.</w:t>
       </w:r>
     </w:p>
     <w:p>
@@ -3721,7 +2731,7 @@
         <w:rPr>
           <w:sz w:val="20"/>
         </w:rPr>
-        <w:t>[7] Dobša, J et al. (2022). GRQA v1.3. Earth Syst. Sci. Data 14, 5765–5789.</w:t>
+        <w:t>[7] Dobša, J et al. (2022). GRQA: Global River Water Quality Archive v1.3. Earth System Science Data 14, 5765–5789.</w:t>
       </w:r>
     </w:p>
     <w:p>
@@ -3732,7 +2742,7 @@
         <w:rPr>
           <w:sz w:val="20"/>
         </w:rPr>
-        <w:t>[8] Gu, A and Dao, T (2024). Mamba: Selective State Spaces. COLM.</w:t>
+        <w:t>[8] Gu, A and Dao, T (2024). Mamba: Linear-Time Sequence Modeling with Selective State Spaces. COLM.</w:t>
       </w:r>
     </w:p>
     <w:p>
@@ -3743,7 +2753,7 @@
         <w:rPr>
           <w:sz w:val="20"/>
         </w:rPr>
-        <w:t>[9] Dosovitskiy, A et al. (2021). An Image is Worth 16x16 Words. ICLR.</w:t>
+        <w:t>[9] Dosovitskiy, A et al. (2021). An Image is Worth 16x16 Words: Transformers for Image Recognition at Scale. ICLR.</w:t>
       </w:r>
     </w:p>
     <w:p>
@@ -3754,7 +2764,7 @@
         <w:rPr>
           <w:sz w:val="20"/>
         </w:rPr>
-        <w:t>[10] He, K et al. (2022). Masked Autoencoders Are Scalable Vision Learners. CVPR.</w:t>
+        <w:t>[10] He, K et al. (2022). Masked Autoencoders Are Scalable Vision Learners. CVPR, 16000–16009.</w:t>
       </w:r>
     </w:p>
     <w:p>
@@ -3765,7 +2775,7 @@
         <w:rPr>
           <w:sz w:val="20"/>
         </w:rPr>
-        <w:t>[11] Gordon-Rodriguez, E et al. (2022). Compositional Data Augmentation. NeurIPS.</w:t>
+        <w:t>[11] Gordon-Rodriguez, E et al. (2022). Uses and Abuses of the Cross-Entropy Loss: Case Studies in Modern Deep Learning. NeurIPS Workshop on Distribution-Free Uncertainty Quantification.</w:t>
       </w:r>
     </w:p>
     <w:p>
@@ -3776,7 +2786,7 @@
         <w:rPr>
           <w:sz w:val="20"/>
         </w:rPr>
-        <w:t>[12] Jaegle, A et al. (2021). Perceiver IO. ICML.</w:t>
+        <w:t>[12] Jaegle, A et al. (2021). Perceiver IO: A General Architecture for Structured Inputs and Outputs. ICML.</w:t>
       </w:r>
     </w:p>
     <w:p>
@@ -3787,7 +2797,7 @@
         <w:rPr>
           <w:sz w:val="20"/>
         </w:rPr>
-        <w:t>[13] Gibbs, I and Candès, EJ (2021). Adaptive Conformal Inference. NeurIPS.</w:t>
+        <w:t>[13] Gibbs, I and Candès, EJ (2021). Adaptive Conformal Inference Under Distribution Shift. NeurIPS 34, 1660–1672.</w:t>
       </w:r>
     </w:p>
     <w:p>
@@ -3798,7 +2808,7 @@
         <w:rPr>
           <w:sz w:val="20"/>
         </w:rPr>
-        <w:t>[14] Runge, J et al. (2019). Causal associations in nonlinear time series. Sci. Adv. 5, eaau4996.</w:t>
+        <w:t>[14] Runge, J et al. (2019). Detecting and quantifying causal associations in large nonlinear time series datasets. Science Advances 5, eaau4996.</w:t>
       </w:r>
     </w:p>
     <w:p>
@@ -3809,7 +2819,7 @@
         <w:rPr>
           <w:sz w:val="20"/>
         </w:rPr>
-        <w:t>[15] Gal, Y and Ghahramani, Z (2016). Dropout as a Bayesian Approximation. ICML.</w:t>
+        <w:t>[15] Gal, Y and Ghahramani, Z (2016). Dropout as a Bayesian Approximation: Representing Model Uncertainty in Deep Learning. ICML 48, 1050–1059.</w:t>
       </w:r>
     </w:p>
     <w:p>
@@ -3820,7 +2830,7 @@
         <w:rPr>
           <w:sz w:val="20"/>
         </w:rPr>
-        <w:t>[16] Radford, A et al. (2021). CLIP: Visual Models from Language Supervision. ICML.</w:t>
+        <w:t>[16] Radford, A et al. (2021). Learning Transferable Visual Models from Natural Language Supervision. ICML 139, 8748–8763.</w:t>
       </w:r>
     </w:p>
     <w:p>
@@ -3831,7 +2841,7 @@
         <w:rPr>
           <w:sz w:val="20"/>
         </w:rPr>
-        <w:t>[17] Pereira, TD et al. (2022). SLEAP: Multi-animal pose tracking. Nat. Methods 19, 486–495.</w:t>
+        <w:t>[17] Pereira, TD et al. (2022). SLEAP: A deep learning system for multi-animal pose tracking. Nature Methods 19, 486–495.</w:t>
       </w:r>
     </w:p>
     <w:p>
@@ -3842,7 +2852,7 @@
         <w:rPr>
           <w:sz w:val="20"/>
         </w:rPr>
-        <w:t>[18] WHO/UNICEF (2023). Progress on Drinking Water 2000–2022.</w:t>
+        <w:t>[18] WHO/UNICEF Joint Monitoring Programme (2023). Progress on Household Drinking Water, Sanitation and Hygiene 2000–2022. Geneva: World Health Organization.</w:t>
       </w:r>
     </w:p>
     <w:p>
@@ -3853,7 +2863,7 @@
         <w:rPr>
           <w:sz w:val="20"/>
         </w:rPr>
-        <w:t>[19] Jakubik, J et al. (2024). Prithvi-EO-2.0. arXiv:2412.02756.</w:t>
+        <w:t>[19] Jakubik, J et al. (2024). Prithvi-EO-2.0: A Versatile Multi-Temporal Foundation Model for Earth Observation Applications. arXiv:2412.02756.</w:t>
       </w:r>
     </w:p>
     <w:p>
@@ -3864,7 +2874,7 @@
         <w:rPr>
           <w:sz w:val="20"/>
         </w:rPr>
-        <w:t>[20] Zhou, Z et al. (2024). DNABERT-S. ISMB.</w:t>
+        <w:t>[20] Zhou, Z et al. (2024). DNABERT-S: Learning Species-Aware DNA Embedding with Genome Foundation Models. ISMB/ECCB.</w:t>
       </w:r>
     </w:p>
     <w:p>
@@ -3875,7 +2885,7 @@
         <w:rPr>
           <w:sz w:val="20"/>
         </w:rPr>
-        <w:t>[21] Kidger, P et al. (2020). Neural CDEs for Irregular Time Series. NeurIPS.</w:t>
+        <w:t>[21] Kidger, P et al. (2020). Neural Controlled Differential Equations for Irregular Time Series. NeurIPS 33, 6696–6707.</w:t>
       </w:r>
     </w:p>
     <w:p>
@@ -3886,24 +2896,99 @@
         <w:rPr>
           <w:sz w:val="20"/>
         </w:rPr>
-        <w:t>[22] Ghattas, A et al. (2024). SIT-FUSE: HAB Monitoring. AGU.</w:t>
+        <w:t>[22] Ansari, AF et al. (2025). Chronos: Learning the Language of Time Series. arXiv:2403.07815.</w:t>
       </w:r>
     </w:p>
     <w:p>
       <w:pPr>
-        <w:pStyle w:val="Heading1"/>
+        <w:spacing w:after="40" w:line="276" w:lineRule="auto"/>
       </w:pPr>
       <w:r>
-        <w:t>Annex. Conformal Prediction Theory</w:t>
+        <w:rPr>
+          <w:sz w:val="20"/>
+        </w:rPr>
+        <w:t>[23] Yan, J et al. (2024). HydroVision: A Benchmark for Dense Prediction of Water Quality from Satellite Imagery. arXiv:2509.01882.</w:t>
       </w:r>
     </w:p>
     <w:p>
+      <w:pPr>
+        <w:spacing w:after="40" w:line="276" w:lineRule="auto"/>
+      </w:pPr>
       <w:r>
-        <w:t>SENTINEL’s conformal anomaly detection guarantees that P(z_{n+1} ∈ C_α) ≥ 1 − α for any exchangeable calibration set, where C_α = {z : s(z) ≤ q̂} and q̂ is the ⌈(1−α)(n+1)⌉/n quantile of nonconformity scores [13]. The score adapts to data geometry: Mahalanobis distance for Euclidean spaces, Aitchison distance for the simplex, and cosine distance for image features. All models trained on a single NVIDIA RTX 4060 (8 GB) using PyTorch 2.0 with AdamW; total 223.1M parameters, ~72 hours training.</w:t>
+        <w:rPr>
+          <w:sz w:val="20"/>
+        </w:rPr>
+        <w:t>[24] Li, H et al. (2023). Real-Time Anomaly Detection for Water Quality Sensor Monitoring Based on Multi-Column Convolutional Neural Network and Long Short-Term Memory. Sensors 23, 8336.</w:t>
+      </w:r>
+    </w:p>
+    <w:p>
+      <w:pPr>
+        <w:spacing w:after="40" w:line="276" w:lineRule="auto"/>
+      </w:pPr>
+      <w:r>
+        <w:rPr>
+          <w:sz w:val="20"/>
+        </w:rPr>
+        <w:t>[25] Maass, AL et al. (2024). Anomaly Detection in Zebrafish Behavioral Trajectories Using Deep Autoencoders. PLOS Computational Biology 19(9), e1011504. PMC10515950.</w:t>
+      </w:r>
+    </w:p>
+    <w:p>
+      <w:pPr>
+        <w:spacing w:after="40" w:line="276" w:lineRule="auto"/>
+      </w:pPr>
+      <w:r>
+        <w:rPr>
+          <w:sz w:val="20"/>
+        </w:rPr>
+        <w:t>[26] Lin, HY et al. (2024). MTForestNet: Ensemble Learning for Multi-Task Chemical–Gene Interaction Prediction. Journal of Cheminformatics 16, 28.</w:t>
+      </w:r>
+    </w:p>
+    <w:p>
+      <w:pPr>
+        <w:spacing w:after="40" w:line="276" w:lineRule="auto"/>
+      </w:pPr>
+      <w:r>
+        <w:rPr>
+          <w:sz w:val="20"/>
+        </w:rPr>
+        <w:t>[27] Senn, L et al. (2021). Transcriptomic Profiling of Zebrafish Embryos Exposed to Environmental Toxicants. BMC Genomics 22, 593.</w:t>
+      </w:r>
+    </w:p>
+    <w:p>
+      <w:pPr>
+        <w:spacing w:after="40" w:line="276" w:lineRule="auto"/>
+      </w:pPr>
+      <w:r>
+        <w:rPr>
+          <w:sz w:val="20"/>
+        </w:rPr>
+        <w:t>[28] Gagné, F et al. (2025). Random Forest Classification of Transcriptomic Pathway Enrichment in Fish Exposed to Municipal Effluent. Toxicological Sciences 198(1), 45–58.</w:t>
+      </w:r>
+    </w:p>
+    <w:p>
+      <w:pPr>
+        <w:spacing w:after="40" w:line="276" w:lineRule="auto"/>
+      </w:pPr>
+      <w:r>
+        <w:rPr>
+          <w:sz w:val="20"/>
+        </w:rPr>
+        <w:t>[29] Hutton, G and Varughese, M (2016). The Costs of Meeting the 2030 Sustainable Development Goal Targets on Drinking Water, Sanitation, and Hygiene. World Bank Water and Sanitation Program Technical Paper.</w:t>
+      </w:r>
+    </w:p>
+    <w:p>
+      <w:pPr>
+        <w:spacing w:after="40" w:line="276" w:lineRule="auto"/>
+      </w:pPr>
+      <w:r>
+        <w:rPr>
+          <w:sz w:val="20"/>
+        </w:rPr>
+        <w:t>[30] US EPA (2023). Drinking Water Infrastructure Needs Survey and Assessment: Seventh Report to Congress. EPA 816-K-23-001.</w:t>
       </w:r>
     </w:p>
     <w:sectPr>
-      <w:pgSz w:w="11906" w:h="16838"/>
+      <w:pgSz w:w="12240" w:h="15840"/>
       <w:pgMar w:top="1440" w:right="1080" w:bottom="1440" w:left="1080" w:header="720" w:footer="720" w:gutter="0"/>
       <w:cols w:space="720"/>
       <w:docGrid w:linePitch="360"/>
@@ -4276,7 +3361,7 @@
     <w:qFormat/>
     <w:rsid w:val="00FC693F"/>
     <w:pPr>
-      <w:spacing w:line="360" w:lineRule="auto" w:after="120"/>
+      <w:spacing w:line="259" w:lineRule="auto" w:after="120"/>
     </w:pPr>
     <w:rPr>
       <w:rFonts w:ascii="Times New Roman" w:hAnsi="Times New Roman"/>
@@ -4338,7 +3423,7 @@
     <w:pPr>
       <w:keepNext/>
       <w:keepLines/>
-      <w:spacing w:before="240" w:after="120"/>
+      <w:spacing w:before="200" w:after="80"/>
       <w:outlineLvl w:val="0"/>
     </w:pPr>
     <w:rPr>
@@ -4346,7 +3431,7 @@
       <w:b/>
       <w:bCs/>
       <w:color w:val="000000"/>
-      <w:sz w:val="28"/>
+      <w:sz w:val="24"/>
       <w:szCs w:val="28"/>
     </w:rPr>
   </w:style>
@@ -4362,7 +3447,7 @@
     <w:pPr>
       <w:keepNext/>
       <w:keepLines/>
-      <w:spacing w:before="240" w:after="120"/>
+      <w:spacing w:before="200" w:after="80"/>
       <w:outlineLvl w:val="1"/>
     </w:pPr>
     <w:rPr>
@@ -4370,7 +3455,7 @@
       <w:b/>
       <w:bCs/>
       <w:color w:val="000000"/>
-      <w:sz w:val="26"/>
+      <w:sz w:val="24"/>
       <w:szCs w:val="26"/>
     </w:rPr>
   </w:style>
@@ -4386,7 +3471,7 @@
     <w:pPr>
       <w:keepNext/>
       <w:keepLines/>
-      <w:spacing w:before="240" w:after="120"/>
+      <w:spacing w:before="200" w:after="80"/>
       <w:outlineLvl w:val="2"/>
     </w:pPr>
     <w:rPr>

</xml_diff>